<commit_message>
Merge review-article references into thesis reference list
Using the reference list of the author's review article (the source of
Chapter 3's original chapter-local citation numbering):

- Resolve 8 previously missing/unverified entries with real sources:
  [24] Tereshchenko & Kyrychenko (exact title match, replaces doubtful
  Manolache attribution), [36] Yakovenko Solana whitepaper (PoH),
  [38] Zhuang et al. Proof of Reputation, [47] Hadi et al. LightGBM
  electricity misuse detection, [75] Zhou et al. microgrid PoC (arXiv),
  [78] Shoup Proof of History, [79] Solana energy report,
  [81] Grunspan & Perez-Marco Proof of Reputation (arXiv)
- Append 60 deduplicated new references as [96]-[155] in IEEE format
  (53 with DOIs, all resolution-checked); in-text citations unchanged
- Update the standalone IEEE thesis-order reference list to match

Co-Authored-By: Claude Fable 5 <noreply@anthropic.com>
Claude-Session: https://claude.ai/code/session_01Le33924H9ectETDkPd9jAv
</commit_message>
<xml_diff>
--- a/docs/citation-correction/PhD-thesis-Raed-Rasheed-IEEE-Citations-Corrected.docx
+++ b/docs/citation-correction/PhD-thesis-Raed-Rasheed-IEEE-Citations-Corrected.docx
@@ -50180,7 +50180,7 @@
               <w:spacing w:after="160" w:line="259" w:lineRule="auto"/>
             </w:pPr>
             <w:r>
-              <w:t xml:space="preserve">A. de Vries, “Bitcoin’s energy consumption is underestimated: A market dynamics approach.”</w:t>
+              <w:t xml:space="preserve">G. Tereshchenko and I. Kyrychenko, “Analysis and Justification of the Use of Existing Blockchain Solutions for the Protection of Digital Assets,” Innovative Technologies and Scientific Solutions for Industries, no. 1(27), pp. 164–178, 2024, doi: 10.30837/ITSSI.2024.27.164.</w:t>
             </w:r>
           </w:p>
         </w:tc>
@@ -50612,7 +50612,7 @@
               <w:spacing w:after="160" w:line="259" w:lineRule="auto"/>
             </w:pPr>
             <w:r>
-              <w:t xml:space="preserve">[Bibliographic entry missing in the original manuscript. This source was cited as [22] in the draft but has no entry in the original reference list; details to be supplied by the author.]</w:t>
+              <w:t xml:space="preserve">A. Yakovenko, “Solana: A New Architecture for a High Performance Blockchain,” white paper, version 0.8.13. [Online]. Available: https://solana.com/solana-whitepaper.pdf</w:t>
             </w:r>
           </w:p>
         </w:tc>
@@ -50684,7 +50684,7 @@
               <w:spacing w:after="160" w:line="259" w:lineRule="auto"/>
             </w:pPr>
             <w:r>
-              <w:t xml:space="preserve">C. T. Danescu-Niculescu-Mizil et al., “Proof of Reputation: A Cooperation-Based System for Blockchains.”</w:t>
+              <w:t xml:space="preserve">Q. Zhuang, Y. Liu, L. Chen, and Z. Ai, “Proof of Reputation: A Reputation-Based Consensus Protocol for Blockchain Based Systems,” in Proc. 2019 International Electronics Communication Conference (IECC), 2019, pp. 131–138, doi: 10.1145/3343147.3343169.</w:t>
             </w:r>
           </w:p>
         </w:tc>
@@ -51008,7 +51008,7 @@
               <w:spacing w:after="160" w:line="259" w:lineRule="auto"/>
             </w:pPr>
             <w:r>
-              <w:t xml:space="preserve">S. Hadi et al., “Data-driven architecture for smart grid load management and microgrid control using blockchain-based IoT.”</w:t>
+              <w:t xml:space="preserve">S. Hadi, W. Syafei, and A. Wibowo, “Architectural Design of Electricity Power Consumption Misuse Detection Based on Light Gradient Boosting Machine Using Blockchain Technology,” in Proc. 2023 International Conference on Technology, Engineering, and Computing Applications (ICTECA), 2023, doi: 10.1109/ICTECA60133.2023.10490464.</w:t>
             </w:r>
           </w:p>
         </w:tc>
@@ -52016,7 +52016,7 @@
               <w:spacing w:after="160" w:line="259" w:lineRule="auto"/>
             </w:pPr>
             <w:r>
-              <w:t xml:space="preserve">“A Microgrid Trading Framework Based on PoC Consensus.”</w:t>
+              <w:t xml:space="preserve">L. Zhou, Y. Xian, Y. Yang, J. Jiang, P. Liu, and X. Li, “A Microgrid Trading Framework Based on PoC Consensus,” arXiv preprint arXiv:2310.07165, 2023, doi: 10.48550/arXiv.2310.07165.</w:t>
             </w:r>
           </w:p>
         </w:tc>
@@ -52124,7 +52124,7 @@
               <w:spacing w:after="160" w:line="259" w:lineRule="auto"/>
             </w:pPr>
             <w:r>
-              <w:t xml:space="preserve">[Bibliographic entry missing in the original manuscript. This source was cited as [68] in the draft but has no entry in the original reference list; details to be supplied by the author.]</w:t>
+              <w:t xml:space="preserve">V. Shoup, “Proof of History: What Is It Good For,” 2022. [Online]. Available: https://www.shoup.net/papers/poh.pdf</w:t>
             </w:r>
           </w:p>
         </w:tc>
@@ -52160,7 +52160,7 @@
               <w:spacing w:after="160" w:line="259" w:lineRule="auto"/>
             </w:pPr>
             <w:r>
-              <w:t xml:space="preserve">[Bibliographic entry missing in the original manuscript. This source was cited as [69] in the draft but has no entry in the original reference list; details to be supplied by the author.]</w:t>
+              <w:t xml:space="preserve">Solana Foundation, “Solana’s Energy Use Report: November 2021,” 2021. [Online]. Available: https://solana.com/news/solana-energy-usage-report-november-2021</w:t>
             </w:r>
           </w:p>
         </w:tc>
@@ -52232,7 +52232,7 @@
               <w:spacing w:after="160" w:line="259" w:lineRule="auto"/>
             </w:pPr>
             <w:r>
-              <w:t xml:space="preserve">“Proof of Reputation.”</w:t>
+              <w:t xml:space="preserve">C. Grunspan and R. Perez-Marco, “Proof of Reputation,” arXiv preprint arXiv:2302.06966, 2023, doi: 10.48550/arXiv.2302.06966.</w:t>
             </w:r>
           </w:p>
         </w:tc>
@@ -52737,6 +52737,2166 @@
             </w:pPr>
             <w:r>
               <w:t xml:space="preserve">R. S. Rasheed, “BlockSim (modified implementation),” GitHub repository, 2026.</w:t>
+            </w:r>
+          </w:p>
+        </w:tc>
+      </w:tr>
+      <w:tr>
+        <w:trPr>
+          <w:tblCellSpacing w:w="15" w:type="dxa"/>
+        </w:trPr>
+        <w:tc>
+          <w:tcPr>
+            <w:tcW w:w="601" w:type="dxa"/>
+            <w:vAlign w:val="center"/>
+            <w:hideMark/>
+          </w:tcPr>
+          <w:p>
+            <w:pPr>
+              <w:spacing w:after="160" w:line="259" w:lineRule="auto"/>
+              <w:jc w:val="left"/>
+            </w:pPr>
+            <w:r>
+              <w:t xml:space="preserve">[96]</w:t>
+            </w:r>
+          </w:p>
+        </w:tc>
+        <w:tc>
+          <w:tcPr>
+            <w:tcW w:w="0" w:type="auto"/>
+            <w:vAlign w:val="center"/>
+            <w:hideMark/>
+          </w:tcPr>
+          <w:p>
+            <w:pPr>
+              <w:spacing w:after="160" w:line="259" w:lineRule="auto"/>
+            </w:pPr>
+            <w:r>
+              <w:t xml:space="preserve">M. N. M. Bhutta et al., “A Survey on Blockchain Technology: Evolution, Architecture and Security,” IEEE Access, vol. 9, pp. 61048–61073, 2021, doi: 10.1109/ACCESS.2021.3072849.</w:t>
+            </w:r>
+          </w:p>
+        </w:tc>
+      </w:tr>
+      <w:tr>
+        <w:trPr>
+          <w:tblCellSpacing w:w="15" w:type="dxa"/>
+        </w:trPr>
+        <w:tc>
+          <w:tcPr>
+            <w:tcW w:w="601" w:type="dxa"/>
+            <w:vAlign w:val="center"/>
+            <w:hideMark/>
+          </w:tcPr>
+          <w:p>
+            <w:pPr>
+              <w:spacing w:after="160" w:line="259" w:lineRule="auto"/>
+              <w:jc w:val="left"/>
+            </w:pPr>
+            <w:r>
+              <w:t xml:space="preserve">[97]</w:t>
+            </w:r>
+          </w:p>
+        </w:tc>
+        <w:tc>
+          <w:tcPr>
+            <w:tcW w:w="0" w:type="auto"/>
+            <w:vAlign w:val="center"/>
+            <w:hideMark/>
+          </w:tcPr>
+          <w:p>
+            <w:pPr>
+              <w:spacing w:after="160" w:line="259" w:lineRule="auto"/>
+            </w:pPr>
+            <w:r>
+              <w:t xml:space="preserve">W. Wang et al., “A Survey on Consensus Mechanisms and Mining Strategy Management in Blockchain Networks,” IEEE Access, vol. 7, pp. 22328–22370, 2019, doi: 10.1109/ACCESS.2019.2896108.</w:t>
+            </w:r>
+          </w:p>
+        </w:tc>
+      </w:tr>
+      <w:tr>
+        <w:trPr>
+          <w:tblCellSpacing w:w="15" w:type="dxa"/>
+        </w:trPr>
+        <w:tc>
+          <w:tcPr>
+            <w:tcW w:w="601" w:type="dxa"/>
+            <w:vAlign w:val="center"/>
+            <w:hideMark/>
+          </w:tcPr>
+          <w:p>
+            <w:pPr>
+              <w:spacing w:after="160" w:line="259" w:lineRule="auto"/>
+              <w:jc w:val="left"/>
+            </w:pPr>
+            <w:r>
+              <w:t xml:space="preserve">[98]</w:t>
+            </w:r>
+          </w:p>
+        </w:tc>
+        <w:tc>
+          <w:tcPr>
+            <w:tcW w:w="0" w:type="auto"/>
+            <w:vAlign w:val="center"/>
+            <w:hideMark/>
+          </w:tcPr>
+          <w:p>
+            <w:pPr>
+              <w:spacing w:after="160" w:line="259" w:lineRule="auto"/>
+            </w:pPr>
+            <w:r>
+              <w:t xml:space="preserve">S. Islam, M. J. Islam, M. Hossain, S. Noor, K.-S. Kwak, and S. M. R. Islam, “A Survey on Consensus Algorithms in Blockchain-Based Applications: Architecture, Taxonomy, and Operational Issues,” IEEE Access, vol. 11, pp. 39066–39082, 2023, doi: 10.1109/ACCESS.2023.3267047.</w:t>
+            </w:r>
+          </w:p>
+        </w:tc>
+      </w:tr>
+      <w:tr>
+        <w:trPr>
+          <w:tblCellSpacing w:w="15" w:type="dxa"/>
+        </w:trPr>
+        <w:tc>
+          <w:tcPr>
+            <w:tcW w:w="601" w:type="dxa"/>
+            <w:vAlign w:val="center"/>
+            <w:hideMark/>
+          </w:tcPr>
+          <w:p>
+            <w:pPr>
+              <w:spacing w:after="160" w:line="259" w:lineRule="auto"/>
+              <w:jc w:val="left"/>
+            </w:pPr>
+            <w:r>
+              <w:t xml:space="preserve">[99]</w:t>
+            </w:r>
+          </w:p>
+        </w:tc>
+        <w:tc>
+          <w:tcPr>
+            <w:tcW w:w="0" w:type="auto"/>
+            <w:vAlign w:val="center"/>
+            <w:hideMark/>
+          </w:tcPr>
+          <w:p>
+            <w:pPr>
+              <w:spacing w:after="160" w:line="259" w:lineRule="auto"/>
+            </w:pPr>
+            <w:r>
+              <w:t xml:space="preserve">D. Hu et al., “Ladder: A Convergence-Based Structured DAG Blockchain for High Throughput and Low Latency,” in Proc. 22nd USENIX Symposium on Networked Systems Design and Implementation (NSDI 25), 779–794. Philadelphia, PA: USENIX Association, 2025. https://dl.acm.org/doi/10.5555/3767955.3767996.</w:t>
+            </w:r>
+          </w:p>
+        </w:tc>
+      </w:tr>
+      <w:tr>
+        <w:trPr>
+          <w:tblCellSpacing w:w="15" w:type="dxa"/>
+        </w:trPr>
+        <w:tc>
+          <w:tcPr>
+            <w:tcW w:w="601" w:type="dxa"/>
+            <w:vAlign w:val="center"/>
+            <w:hideMark/>
+          </w:tcPr>
+          <w:p>
+            <w:pPr>
+              <w:spacing w:after="160" w:line="259" w:lineRule="auto"/>
+              <w:jc w:val="left"/>
+            </w:pPr>
+            <w:r>
+              <w:t xml:space="preserve">[100]</w:t>
+            </w:r>
+          </w:p>
+        </w:tc>
+        <w:tc>
+          <w:tcPr>
+            <w:tcW w:w="0" w:type="auto"/>
+            <w:vAlign w:val="center"/>
+            <w:hideMark/>
+          </w:tcPr>
+          <w:p>
+            <w:pPr>
+              <w:spacing w:after="160" w:line="259" w:lineRule="auto"/>
+            </w:pPr>
+            <w:r>
+              <w:t xml:space="preserve">H. Lyu, S. Xie, J. Niu, I. Beschastnikh, Y. Zhang, M. Sadoghi, and C. Feng, “Orthrus: Accelerating Multi-BFT Consensus through Concurrent Partial Ordering of Transactions,” in Proc. 2025 IEEE 41st International Conference on Data Engineering (ICDE), 2615–2627, 2025. doi: 10.1109/ICDE65448.2025.00197.</w:t>
+            </w:r>
+          </w:p>
+        </w:tc>
+      </w:tr>
+      <w:tr>
+        <w:trPr>
+          <w:tblCellSpacing w:w="15" w:type="dxa"/>
+        </w:trPr>
+        <w:tc>
+          <w:tcPr>
+            <w:tcW w:w="601" w:type="dxa"/>
+            <w:vAlign w:val="center"/>
+            <w:hideMark/>
+          </w:tcPr>
+          <w:p>
+            <w:pPr>
+              <w:spacing w:after="160" w:line="259" w:lineRule="auto"/>
+              <w:jc w:val="left"/>
+            </w:pPr>
+            <w:r>
+              <w:t xml:space="preserve">[101]</w:t>
+            </w:r>
+          </w:p>
+        </w:tc>
+        <w:tc>
+          <w:tcPr>
+            <w:tcW w:w="0" w:type="auto"/>
+            <w:vAlign w:val="center"/>
+            <w:hideMark/>
+          </w:tcPr>
+          <w:p>
+            <w:pPr>
+              <w:spacing w:after="160" w:line="259" w:lineRule="auto"/>
+            </w:pPr>
+            <w:r>
+              <w:t xml:space="preserve">H. Xu, X. Liu, C. Zhang, W. Wang, J. Wang, and K. Li, “Crackle: A Fast Sector-Based BFT Consensus with Sublinear Communication Complexity,” in Proc. IEEE INFOCOM 2024, 1–10, 2024. doi: 10.1109/INFOCOM52122.2024.10621123.</w:t>
+            </w:r>
+          </w:p>
+        </w:tc>
+      </w:tr>
+      <w:tr>
+        <w:trPr>
+          <w:tblCellSpacing w:w="15" w:type="dxa"/>
+        </w:trPr>
+        <w:tc>
+          <w:tcPr>
+            <w:tcW w:w="601" w:type="dxa"/>
+            <w:vAlign w:val="center"/>
+            <w:hideMark/>
+          </w:tcPr>
+          <w:p>
+            <w:pPr>
+              <w:spacing w:after="160" w:line="259" w:lineRule="auto"/>
+              <w:jc w:val="left"/>
+            </w:pPr>
+            <w:r>
+              <w:t xml:space="preserve">[102]</w:t>
+            </w:r>
+          </w:p>
+        </w:tc>
+        <w:tc>
+          <w:tcPr>
+            <w:tcW w:w="0" w:type="auto"/>
+            <w:vAlign w:val="center"/>
+            <w:hideMark/>
+          </w:tcPr>
+          <w:p>
+            <w:pPr>
+              <w:spacing w:after="160" w:line="259" w:lineRule="auto"/>
+            </w:pPr>
+            <w:r>
+              <w:t xml:space="preserve">M. J. Page et al., “The PRISMA 2020 Statement: An Updated Guideline for Reporting Systematic Reviews,” BMJ, vol. 372, Art. no. n71, 2021, doi: 10.1136/bmj.n71.</w:t>
+            </w:r>
+          </w:p>
+        </w:tc>
+      </w:tr>
+      <w:tr>
+        <w:trPr>
+          <w:tblCellSpacing w:w="15" w:type="dxa"/>
+        </w:trPr>
+        <w:tc>
+          <w:tcPr>
+            <w:tcW w:w="601" w:type="dxa"/>
+            <w:vAlign w:val="center"/>
+            <w:hideMark/>
+          </w:tcPr>
+          <w:p>
+            <w:pPr>
+              <w:spacing w:after="160" w:line="259" w:lineRule="auto"/>
+              <w:jc w:val="left"/>
+            </w:pPr>
+            <w:r>
+              <w:t xml:space="preserve">[103]</w:t>
+            </w:r>
+          </w:p>
+        </w:tc>
+        <w:tc>
+          <w:tcPr>
+            <w:tcW w:w="0" w:type="auto"/>
+            <w:vAlign w:val="center"/>
+            <w:hideMark/>
+          </w:tcPr>
+          <w:p>
+            <w:pPr>
+              <w:spacing w:after="160" w:line="259" w:lineRule="auto"/>
+            </w:pPr>
+            <w:r>
+              <w:t xml:space="preserve">M. J. Page et al., “PRISMA 2020 Explanation and Elaboration: Updated Guidance and Exemplars for Reporting Systematic Reviews,” BMJ, vol. 372, Art. no. n160, 2021, doi: 10.1136/bmj.n160.</w:t>
+            </w:r>
+          </w:p>
+        </w:tc>
+      </w:tr>
+      <w:tr>
+        <w:trPr>
+          <w:tblCellSpacing w:w="15" w:type="dxa"/>
+        </w:trPr>
+        <w:tc>
+          <w:tcPr>
+            <w:tcW w:w="601" w:type="dxa"/>
+            <w:vAlign w:val="center"/>
+            <w:hideMark/>
+          </w:tcPr>
+          <w:p>
+            <w:pPr>
+              <w:spacing w:after="160" w:line="259" w:lineRule="auto"/>
+              <w:jc w:val="left"/>
+            </w:pPr>
+            <w:r>
+              <w:t xml:space="preserve">[104]</w:t>
+            </w:r>
+          </w:p>
+        </w:tc>
+        <w:tc>
+          <w:tcPr>
+            <w:tcW w:w="0" w:type="auto"/>
+            <w:vAlign w:val="center"/>
+            <w:hideMark/>
+          </w:tcPr>
+          <w:p>
+            <w:pPr>
+              <w:spacing w:after="160" w:line="259" w:lineRule="auto"/>
+            </w:pPr>
+            <w:r>
+              <w:t xml:space="preserve">B. Kitchenham and S. Charters, Guidelines for Performing Systematic Literature Reviews in Software Engineering, EBSE Technical Report EBSE-2007-01, Keele University and Durham University, 2007. [Online]. Available: https://legacyfileshare.elsevier.com/promis_misc/525444systematicreviewsguide.pdf</w:t>
+            </w:r>
+          </w:p>
+        </w:tc>
+      </w:tr>
+      <w:tr>
+        <w:trPr>
+          <w:tblCellSpacing w:w="15" w:type="dxa"/>
+        </w:trPr>
+        <w:tc>
+          <w:tcPr>
+            <w:tcW w:w="601" w:type="dxa"/>
+            <w:vAlign w:val="center"/>
+            <w:hideMark/>
+          </w:tcPr>
+          <w:p>
+            <w:pPr>
+              <w:spacing w:after="160" w:line="259" w:lineRule="auto"/>
+              <w:jc w:val="left"/>
+            </w:pPr>
+            <w:r>
+              <w:t xml:space="preserve">[105]</w:t>
+            </w:r>
+          </w:p>
+        </w:tc>
+        <w:tc>
+          <w:tcPr>
+            <w:tcW w:w="0" w:type="auto"/>
+            <w:vAlign w:val="center"/>
+            <w:hideMark/>
+          </w:tcPr>
+          <w:p>
+            <w:pPr>
+              <w:spacing w:after="160" w:line="259" w:lineRule="auto"/>
+            </w:pPr>
+            <w:r>
+              <w:t xml:space="preserve">IEEE Professional Communication Society, Author Guidelines for Integrative Literature Reviews, 2019. [Online]. Available: https://procomm.ieee.org/wp-content/uploads/2019/05/Author-Guidelines-for-Integrative-Literature-Reviews.pdf</w:t>
+            </w:r>
+          </w:p>
+        </w:tc>
+      </w:tr>
+      <w:tr>
+        <w:trPr>
+          <w:tblCellSpacing w:w="15" w:type="dxa"/>
+        </w:trPr>
+        <w:tc>
+          <w:tcPr>
+            <w:tcW w:w="601" w:type="dxa"/>
+            <w:vAlign w:val="center"/>
+            <w:hideMark/>
+          </w:tcPr>
+          <w:p>
+            <w:pPr>
+              <w:spacing w:after="160" w:line="259" w:lineRule="auto"/>
+              <w:jc w:val="left"/>
+            </w:pPr>
+            <w:r>
+              <w:t xml:space="preserve">[106]</w:t>
+            </w:r>
+          </w:p>
+        </w:tc>
+        <w:tc>
+          <w:tcPr>
+            <w:tcW w:w="0" w:type="auto"/>
+            <w:vAlign w:val="center"/>
+            <w:hideMark/>
+          </w:tcPr>
+          <w:p>
+            <w:pPr>
+              <w:spacing w:after="160" w:line="259" w:lineRule="auto"/>
+            </w:pPr>
+            <w:r>
+              <w:t xml:space="preserve">M. R. Islam, M. M. Rashid, M. A. Rahman, M. H. S. Mohamad, and A. H. Bin Embong, “A Comprehensive Analysis of Blockchain-Based Cryptocurrency Mining Impact on Energy Consumption,” International Journal of Advanced Computer Science and Applications, vol. 13, no. 4, pp. 590–598, 2022, doi: 10.14569/IJACSA.2022.0130469.</w:t>
+            </w:r>
+          </w:p>
+        </w:tc>
+      </w:tr>
+      <w:tr>
+        <w:trPr>
+          <w:tblCellSpacing w:w="15" w:type="dxa"/>
+        </w:trPr>
+        <w:tc>
+          <w:tcPr>
+            <w:tcW w:w="601" w:type="dxa"/>
+            <w:vAlign w:val="center"/>
+            <w:hideMark/>
+          </w:tcPr>
+          <w:p>
+            <w:pPr>
+              <w:spacing w:after="160" w:line="259" w:lineRule="auto"/>
+              <w:jc w:val="left"/>
+            </w:pPr>
+            <w:r>
+              <w:t xml:space="preserve">[107]</w:t>
+            </w:r>
+          </w:p>
+        </w:tc>
+        <w:tc>
+          <w:tcPr>
+            <w:tcW w:w="0" w:type="auto"/>
+            <w:vAlign w:val="center"/>
+            <w:hideMark/>
+          </w:tcPr>
+          <w:p>
+            <w:pPr>
+              <w:spacing w:after="160" w:line="259" w:lineRule="auto"/>
+            </w:pPr>
+            <w:r>
+              <w:t xml:space="preserve">A. Elsanousi, E. Pei, and K. Mershad, “Proactive Blockchain Deployment Mechanism in Resource-Constrained Rate-Splitting Multiple Access IoT Networks,” Internet of Things, vol. 27, Art. no. 101328, 2024, doi: 10.1016/j.iot.2024.101328.</w:t>
+            </w:r>
+          </w:p>
+        </w:tc>
+      </w:tr>
+      <w:tr>
+        <w:trPr>
+          <w:tblCellSpacing w:w="15" w:type="dxa"/>
+        </w:trPr>
+        <w:tc>
+          <w:tcPr>
+            <w:tcW w:w="601" w:type="dxa"/>
+            <w:vAlign w:val="center"/>
+            <w:hideMark/>
+          </w:tcPr>
+          <w:p>
+            <w:pPr>
+              <w:spacing w:after="160" w:line="259" w:lineRule="auto"/>
+              <w:jc w:val="left"/>
+            </w:pPr>
+            <w:r>
+              <w:t xml:space="preserve">[108]</w:t>
+            </w:r>
+          </w:p>
+        </w:tc>
+        <w:tc>
+          <w:tcPr>
+            <w:tcW w:w="0" w:type="auto"/>
+            <w:vAlign w:val="center"/>
+            <w:hideMark/>
+          </w:tcPr>
+          <w:p>
+            <w:pPr>
+              <w:spacing w:after="160" w:line="259" w:lineRule="auto"/>
+            </w:pPr>
+            <w:r>
+              <w:t xml:space="preserve">M. S. Ali, M. Vecchio, M. Pincheira, K. Dolui, F. Antonelli, and M. H. ur Rehman, “Applications of Blockchains in the Internet of Things: A Comprehensive Survey,” IEEE Communications Surveys &amp; Tutorials, vol. 21, no. 2, pp. 1676–1717, 2019, doi: 10.1109/COMST.2018.2886932.</w:t>
+            </w:r>
+          </w:p>
+        </w:tc>
+      </w:tr>
+      <w:tr>
+        <w:trPr>
+          <w:tblCellSpacing w:w="15" w:type="dxa"/>
+        </w:trPr>
+        <w:tc>
+          <w:tcPr>
+            <w:tcW w:w="601" w:type="dxa"/>
+            <w:vAlign w:val="center"/>
+            <w:hideMark/>
+          </w:tcPr>
+          <w:p>
+            <w:pPr>
+              <w:spacing w:after="160" w:line="259" w:lineRule="auto"/>
+              <w:jc w:val="left"/>
+            </w:pPr>
+            <w:r>
+              <w:t xml:space="preserve">[109]</w:t>
+            </w:r>
+          </w:p>
+        </w:tc>
+        <w:tc>
+          <w:tcPr>
+            <w:tcW w:w="0" w:type="auto"/>
+            <w:vAlign w:val="center"/>
+            <w:hideMark/>
+          </w:tcPr>
+          <w:p>
+            <w:pPr>
+              <w:spacing w:after="160" w:line="259" w:lineRule="auto"/>
+            </w:pPr>
+            <w:r>
+              <w:t xml:space="preserve">E. Atay and J. L. Y. Tong, “The Impact of Blockchain Technology on Human Resource Management,” in Handbook of Research on Social Impacts of E-Payment and Blockchain Technology, 160–177. Hershey, PA: IGI Global, 2022. doi: 10.4018/978-1-7998-9035-5.ch009.</w:t>
+            </w:r>
+          </w:p>
+        </w:tc>
+      </w:tr>
+      <w:tr>
+        <w:trPr>
+          <w:tblCellSpacing w:w="15" w:type="dxa"/>
+        </w:trPr>
+        <w:tc>
+          <w:tcPr>
+            <w:tcW w:w="601" w:type="dxa"/>
+            <w:vAlign w:val="center"/>
+            <w:hideMark/>
+          </w:tcPr>
+          <w:p>
+            <w:pPr>
+              <w:spacing w:after="160" w:line="259" w:lineRule="auto"/>
+              <w:jc w:val="left"/>
+            </w:pPr>
+            <w:r>
+              <w:t xml:space="preserve">[110]</w:t>
+            </w:r>
+          </w:p>
+        </w:tc>
+        <w:tc>
+          <w:tcPr>
+            <w:tcW w:w="0" w:type="auto"/>
+            <w:vAlign w:val="center"/>
+            <w:hideMark/>
+          </w:tcPr>
+          <w:p>
+            <w:pPr>
+              <w:spacing w:after="160" w:line="259" w:lineRule="auto"/>
+            </w:pPr>
+            <w:r>
+              <w:t xml:space="preserve">Hyperledger Foundation, “Hyperledger Foundation,” Accessed: Mar. 28, 2026. [Online]. Available: https://hyperledger.github.io/</w:t>
+            </w:r>
+          </w:p>
+        </w:tc>
+      </w:tr>
+      <w:tr>
+        <w:trPr>
+          <w:tblCellSpacing w:w="15" w:type="dxa"/>
+        </w:trPr>
+        <w:tc>
+          <w:tcPr>
+            <w:tcW w:w="601" w:type="dxa"/>
+            <w:vAlign w:val="center"/>
+            <w:hideMark/>
+          </w:tcPr>
+          <w:p>
+            <w:pPr>
+              <w:spacing w:after="160" w:line="259" w:lineRule="auto"/>
+              <w:jc w:val="left"/>
+            </w:pPr>
+            <w:r>
+              <w:t xml:space="preserve">[111]</w:t>
+            </w:r>
+          </w:p>
+        </w:tc>
+        <w:tc>
+          <w:tcPr>
+            <w:tcW w:w="0" w:type="auto"/>
+            <w:vAlign w:val="center"/>
+            <w:hideMark/>
+          </w:tcPr>
+          <w:p>
+            <w:pPr>
+              <w:spacing w:after="160" w:line="259" w:lineRule="auto"/>
+            </w:pPr>
+            <w:r>
+              <w:t xml:space="preserve">S. Alam, S. Bhatia, M. Shuaib, M. M. Khubrani, F. Alfayez, A. A. Malibari, and S. Ahmad, “An Overview of Blockchain and IoT Integration for Secure and Reliable Health Records Monitoring,” Sustainability, vol. 15, no. 7, Art. no. 5660, 2023, doi: 10.3390/su15075660.</w:t>
+            </w:r>
+          </w:p>
+        </w:tc>
+      </w:tr>
+      <w:tr>
+        <w:trPr>
+          <w:tblCellSpacing w:w="15" w:type="dxa"/>
+        </w:trPr>
+        <w:tc>
+          <w:tcPr>
+            <w:tcW w:w="601" w:type="dxa"/>
+            <w:vAlign w:val="center"/>
+            <w:hideMark/>
+          </w:tcPr>
+          <w:p>
+            <w:pPr>
+              <w:spacing w:after="160" w:line="259" w:lineRule="auto"/>
+              <w:jc w:val="left"/>
+            </w:pPr>
+            <w:r>
+              <w:t xml:space="preserve">[112]</w:t>
+            </w:r>
+          </w:p>
+        </w:tc>
+        <w:tc>
+          <w:tcPr>
+            <w:tcW w:w="0" w:type="auto"/>
+            <w:vAlign w:val="center"/>
+            <w:hideMark/>
+          </w:tcPr>
+          <w:p>
+            <w:pPr>
+              <w:spacing w:after="160" w:line="259" w:lineRule="auto"/>
+            </w:pPr>
+            <w:r>
+              <w:t xml:space="preserve">M. Sánchez-de la Rosa, C. Núñez-Gómez, M. B. Caminero, and C. Carrión, “Exploring the Use of Blockchain in Resource-Constrained Fog Computing Environments,” Software: Practice and Experience, vol. 53, no. 4, pp. 971–87, 2023, doi: 10.1002/spe.3173.</w:t>
+            </w:r>
+          </w:p>
+        </w:tc>
+      </w:tr>
+      <w:tr>
+        <w:trPr>
+          <w:tblCellSpacing w:w="15" w:type="dxa"/>
+        </w:trPr>
+        <w:tc>
+          <w:tcPr>
+            <w:tcW w:w="601" w:type="dxa"/>
+            <w:vAlign w:val="center"/>
+            <w:hideMark/>
+          </w:tcPr>
+          <w:p>
+            <w:pPr>
+              <w:spacing w:after="160" w:line="259" w:lineRule="auto"/>
+              <w:jc w:val="left"/>
+            </w:pPr>
+            <w:r>
+              <w:t xml:space="preserve">[113]</w:t>
+            </w:r>
+          </w:p>
+        </w:tc>
+        <w:tc>
+          <w:tcPr>
+            <w:tcW w:w="0" w:type="auto"/>
+            <w:vAlign w:val="center"/>
+            <w:hideMark/>
+          </w:tcPr>
+          <w:p>
+            <w:pPr>
+              <w:spacing w:after="160" w:line="259" w:lineRule="auto"/>
+            </w:pPr>
+            <w:r>
+              <w:t xml:space="preserve">K. Z. Azar, H. M. Kamali, H. Homayoun, and A. Sasan, “From Cryptography to Logic Locking: A Survey on the Architecture Evolution of Secure Scan Chains,” IEEE Access, vol. 9, pp. 73133–73151, 2021, doi: 10.1109/ACCESS.2021.3080257.</w:t>
+            </w:r>
+          </w:p>
+        </w:tc>
+      </w:tr>
+      <w:tr>
+        <w:trPr>
+          <w:tblCellSpacing w:w="15" w:type="dxa"/>
+        </w:trPr>
+        <w:tc>
+          <w:tcPr>
+            <w:tcW w:w="601" w:type="dxa"/>
+            <w:vAlign w:val="center"/>
+            <w:hideMark/>
+          </w:tcPr>
+          <w:p>
+            <w:pPr>
+              <w:spacing w:after="160" w:line="259" w:lineRule="auto"/>
+              <w:jc w:val="left"/>
+            </w:pPr>
+            <w:r>
+              <w:t xml:space="preserve">[114]</w:t>
+            </w:r>
+          </w:p>
+        </w:tc>
+        <w:tc>
+          <w:tcPr>
+            <w:tcW w:w="0" w:type="auto"/>
+            <w:vAlign w:val="center"/>
+            <w:hideMark/>
+          </w:tcPr>
+          <w:p>
+            <w:pPr>
+              <w:spacing w:after="160" w:line="259" w:lineRule="auto"/>
+            </w:pPr>
+            <w:r>
+              <w:t xml:space="preserve">B. Hammi, S. Zeadally, and J. Nebhen, “Security Threats, Countermeasures, and Challenges of Digital Supply Chains,” ACM Computing Surveys, vol. 55, no. 14S, Art. no. 316, 2023, doi: 10.1145/3588999.</w:t>
+            </w:r>
+          </w:p>
+        </w:tc>
+      </w:tr>
+      <w:tr>
+        <w:trPr>
+          <w:tblCellSpacing w:w="15" w:type="dxa"/>
+        </w:trPr>
+        <w:tc>
+          <w:tcPr>
+            <w:tcW w:w="601" w:type="dxa"/>
+            <w:vAlign w:val="center"/>
+            <w:hideMark/>
+          </w:tcPr>
+          <w:p>
+            <w:pPr>
+              <w:spacing w:after="160" w:line="259" w:lineRule="auto"/>
+              <w:jc w:val="left"/>
+            </w:pPr>
+            <w:r>
+              <w:t xml:space="preserve">[115]</w:t>
+            </w:r>
+          </w:p>
+        </w:tc>
+        <w:tc>
+          <w:tcPr>
+            <w:tcW w:w="0" w:type="auto"/>
+            <w:vAlign w:val="center"/>
+            <w:hideMark/>
+          </w:tcPr>
+          <w:p>
+            <w:pPr>
+              <w:spacing w:after="160" w:line="259" w:lineRule="auto"/>
+            </w:pPr>
+            <w:r>
+              <w:t xml:space="preserve">J. Dutta and D. Puthal, “PoAh 2.0: AI-Empowered Dynamic Authentication Based Adaptive Blockchain Consensus for IoMT-Edge Workflow,” Future Generation Computer Systems, vol. 161, pp. 655–72, 2024, doi: 10.1016/j.future.2024.07.048.</w:t>
+            </w:r>
+          </w:p>
+        </w:tc>
+      </w:tr>
+      <w:tr>
+        <w:trPr>
+          <w:tblCellSpacing w:w="15" w:type="dxa"/>
+        </w:trPr>
+        <w:tc>
+          <w:tcPr>
+            <w:tcW w:w="601" w:type="dxa"/>
+            <w:vAlign w:val="center"/>
+            <w:hideMark/>
+          </w:tcPr>
+          <w:p>
+            <w:pPr>
+              <w:spacing w:after="160" w:line="259" w:lineRule="auto"/>
+              <w:jc w:val="left"/>
+            </w:pPr>
+            <w:r>
+              <w:t xml:space="preserve">[116]</w:t>
+            </w:r>
+          </w:p>
+        </w:tc>
+        <w:tc>
+          <w:tcPr>
+            <w:tcW w:w="0" w:type="auto"/>
+            <w:vAlign w:val="center"/>
+            <w:hideMark/>
+          </w:tcPr>
+          <w:p>
+            <w:pPr>
+              <w:spacing w:after="160" w:line="259" w:lineRule="auto"/>
+            </w:pPr>
+            <w:r>
+              <w:t xml:space="preserve">J. Pennekamp, F. Alder, R. Matzutt, J. T. Mühlberg, F. Piessens, and K. Wehrle, “Secure End-to-End Sensing in Supply Chains,” in 2020 IEEE Conference on Communications and Network Security (CNS), 1–6. 2020. doi: 10.1109/CNS48642.2020.9162337.</w:t>
+            </w:r>
+          </w:p>
+        </w:tc>
+      </w:tr>
+      <w:tr>
+        <w:trPr>
+          <w:tblCellSpacing w:w="15" w:type="dxa"/>
+        </w:trPr>
+        <w:tc>
+          <w:tcPr>
+            <w:tcW w:w="601" w:type="dxa"/>
+            <w:vAlign w:val="center"/>
+            <w:hideMark/>
+          </w:tcPr>
+          <w:p>
+            <w:pPr>
+              <w:spacing w:after="160" w:line="259" w:lineRule="auto"/>
+              <w:jc w:val="left"/>
+            </w:pPr>
+            <w:r>
+              <w:t xml:space="preserve">[117]</w:t>
+            </w:r>
+          </w:p>
+        </w:tc>
+        <w:tc>
+          <w:tcPr>
+            <w:tcW w:w="0" w:type="auto"/>
+            <w:vAlign w:val="center"/>
+            <w:hideMark/>
+          </w:tcPr>
+          <w:p>
+            <w:pPr>
+              <w:spacing w:after="160" w:line="259" w:lineRule="auto"/>
+            </w:pPr>
+            <w:r>
+              <w:t xml:space="preserve">S. Jangirala, A. K. Das, and A. V. Vasilakos, “Designing Secure Lightweight Blockchain-Enabled RFID-Based Authentication Protocol for Supply Chains in 5G Mobile Edge Computing Environment,” IEEE Transactions on Industrial Informatics, vol. 16, no. 11, pp. 7081–93, 2020, doi: 10.1109/TII.2019.2942389.</w:t>
+            </w:r>
+          </w:p>
+        </w:tc>
+      </w:tr>
+      <w:tr>
+        <w:trPr>
+          <w:tblCellSpacing w:w="15" w:type="dxa"/>
+        </w:trPr>
+        <w:tc>
+          <w:tcPr>
+            <w:tcW w:w="601" w:type="dxa"/>
+            <w:vAlign w:val="center"/>
+            <w:hideMark/>
+          </w:tcPr>
+          <w:p>
+            <w:pPr>
+              <w:spacing w:after="160" w:line="259" w:lineRule="auto"/>
+              <w:jc w:val="left"/>
+            </w:pPr>
+            <w:r>
+              <w:t xml:space="preserve">[118]</w:t>
+            </w:r>
+          </w:p>
+        </w:tc>
+        <w:tc>
+          <w:tcPr>
+            <w:tcW w:w="0" w:type="auto"/>
+            <w:vAlign w:val="center"/>
+            <w:hideMark/>
+          </w:tcPr>
+          <w:p>
+            <w:pPr>
+              <w:spacing w:after="160" w:line="259" w:lineRule="auto"/>
+            </w:pPr>
+            <w:r>
+              <w:t xml:space="preserve">A. EL Azzaoui, H. Chen, S. H. Kim, Y. Pan, and J. H. Park, “Blockchain-Based Distributed Information Hiding Framework for Data Privacy Preserving in Medical Supply Chain Systems,” Sensors, vol. 22, no. 4, Art. no. 1371, 2022, doi: 10.3390/s22041371.</w:t>
+            </w:r>
+          </w:p>
+        </w:tc>
+      </w:tr>
+      <w:tr>
+        <w:trPr>
+          <w:tblCellSpacing w:w="15" w:type="dxa"/>
+        </w:trPr>
+        <w:tc>
+          <w:tcPr>
+            <w:tcW w:w="601" w:type="dxa"/>
+            <w:vAlign w:val="center"/>
+            <w:hideMark/>
+          </w:tcPr>
+          <w:p>
+            <w:pPr>
+              <w:spacing w:after="160" w:line="259" w:lineRule="auto"/>
+              <w:jc w:val="left"/>
+            </w:pPr>
+            <w:r>
+              <w:t xml:space="preserve">[119]</w:t>
+            </w:r>
+          </w:p>
+        </w:tc>
+        <w:tc>
+          <w:tcPr>
+            <w:tcW w:w="0" w:type="auto"/>
+            <w:vAlign w:val="center"/>
+            <w:hideMark/>
+          </w:tcPr>
+          <w:p>
+            <w:pPr>
+              <w:spacing w:after="160" w:line="259" w:lineRule="auto"/>
+            </w:pPr>
+            <w:r>
+              <w:t xml:space="preserve">M. S. Solmaz and M. Koray, “Blockchain Technology in Maritime Transportation and Management,” in Handbook of Research on the Applications of International Transportation and Logistics for World Trade, 483–99. Hershey, PA: IGI Global, 2020. doi: 10.4018/978-1-7998-1397-2.ch026.</w:t>
+            </w:r>
+          </w:p>
+        </w:tc>
+      </w:tr>
+      <w:tr>
+        <w:trPr>
+          <w:tblCellSpacing w:w="15" w:type="dxa"/>
+        </w:trPr>
+        <w:tc>
+          <w:tcPr>
+            <w:tcW w:w="601" w:type="dxa"/>
+            <w:vAlign w:val="center"/>
+            <w:hideMark/>
+          </w:tcPr>
+          <w:p>
+            <w:pPr>
+              <w:spacing w:after="160" w:line="259" w:lineRule="auto"/>
+              <w:jc w:val="left"/>
+            </w:pPr>
+            <w:r>
+              <w:t xml:space="preserve">[120]</w:t>
+            </w:r>
+          </w:p>
+        </w:tc>
+        <w:tc>
+          <w:tcPr>
+            <w:tcW w:w="0" w:type="auto"/>
+            <w:vAlign w:val="center"/>
+            <w:hideMark/>
+          </w:tcPr>
+          <w:p>
+            <w:pPr>
+              <w:spacing w:after="160" w:line="259" w:lineRule="auto"/>
+            </w:pPr>
+            <w:r>
+              <w:t xml:space="preserve">O. Zumburidze, N. Adamashvili, R. State, R. Tonelli, and H. Taherdoost, “Blockchain Integration and Its Impact on Renewable Energy,” Computers, vol. 13, no. 4, Art. no. 107, 2024, doi: 10.3390/computers13040107.</w:t>
+            </w:r>
+          </w:p>
+        </w:tc>
+      </w:tr>
+      <w:tr>
+        <w:trPr>
+          <w:tblCellSpacing w:w="15" w:type="dxa"/>
+        </w:trPr>
+        <w:tc>
+          <w:tcPr>
+            <w:tcW w:w="601" w:type="dxa"/>
+            <w:vAlign w:val="center"/>
+            <w:hideMark/>
+          </w:tcPr>
+          <w:p>
+            <w:pPr>
+              <w:spacing w:after="160" w:line="259" w:lineRule="auto"/>
+              <w:jc w:val="left"/>
+            </w:pPr>
+            <w:r>
+              <w:t xml:space="preserve">[121]</w:t>
+            </w:r>
+          </w:p>
+        </w:tc>
+        <w:tc>
+          <w:tcPr>
+            <w:tcW w:w="0" w:type="auto"/>
+            <w:vAlign w:val="center"/>
+            <w:hideMark/>
+          </w:tcPr>
+          <w:p>
+            <w:pPr>
+              <w:spacing w:after="160" w:line="259" w:lineRule="auto"/>
+            </w:pPr>
+            <w:r>
+              <w:t xml:space="preserve">W. Yao, F. P. Deek, R. Murimi, and G. Wang, “SoK: A Taxonomy for Critical Analysis of Consensus Mechanisms in Consortium Blockchain,” IEEE Access, vol. 11, pp. 79572–79587, 2023, doi: 10.1109/ACCESS.2023.3298675.</w:t>
+            </w:r>
+          </w:p>
+        </w:tc>
+      </w:tr>
+      <w:tr>
+        <w:trPr>
+          <w:tblCellSpacing w:w="15" w:type="dxa"/>
+        </w:trPr>
+        <w:tc>
+          <w:tcPr>
+            <w:tcW w:w="601" w:type="dxa"/>
+            <w:vAlign w:val="center"/>
+            <w:hideMark/>
+          </w:tcPr>
+          <w:p>
+            <w:pPr>
+              <w:spacing w:after="160" w:line="259" w:lineRule="auto"/>
+              <w:jc w:val="left"/>
+            </w:pPr>
+            <w:r>
+              <w:t xml:space="preserve">[122]</w:t>
+            </w:r>
+          </w:p>
+        </w:tc>
+        <w:tc>
+          <w:tcPr>
+            <w:tcW w:w="0" w:type="auto"/>
+            <w:vAlign w:val="center"/>
+            <w:hideMark/>
+          </w:tcPr>
+          <w:p>
+            <w:pPr>
+              <w:spacing w:after="160" w:line="259" w:lineRule="auto"/>
+            </w:pPr>
+            <w:r>
+              <w:t xml:space="preserve">A. Bhoware, K. Jajulwar, A. Deshmukh, K. Dabhekar, S. Ghodmare, and A. Gulghane, “Performance Analysis of Network Security System Using Bioinspired-Blockchain Technique for IP Networks,” in 2023 11th International Conference on Emerging Trends in Engineering and Technology. 2023. doi: 10.1109/ICETET-SIP58143.2023.10151475.</w:t>
+            </w:r>
+          </w:p>
+        </w:tc>
+      </w:tr>
+      <w:tr>
+        <w:trPr>
+          <w:tblCellSpacing w:w="15" w:type="dxa"/>
+        </w:trPr>
+        <w:tc>
+          <w:tcPr>
+            <w:tcW w:w="601" w:type="dxa"/>
+            <w:vAlign w:val="center"/>
+            <w:hideMark/>
+          </w:tcPr>
+          <w:p>
+            <w:pPr>
+              <w:spacing w:after="160" w:line="259" w:lineRule="auto"/>
+              <w:jc w:val="left"/>
+            </w:pPr>
+            <w:r>
+              <w:t xml:space="preserve">[123]</w:t>
+            </w:r>
+          </w:p>
+        </w:tc>
+        <w:tc>
+          <w:tcPr>
+            <w:tcW w:w="0" w:type="auto"/>
+            <w:vAlign w:val="center"/>
+            <w:hideMark/>
+          </w:tcPr>
+          <w:p>
+            <w:pPr>
+              <w:spacing w:after="160" w:line="259" w:lineRule="auto"/>
+            </w:pPr>
+            <w:r>
+              <w:t xml:space="preserve">R. S. Vairagade and B. S. Hanumantha, “Secure Internet of Things Network Using Light-Weighted Trust and Blockchain-Powered PoW Framework,” Concurrency and Computation: Practice and Experience 34, no. 21 (2022). doi: 10.1002/cpe.7057.</w:t>
+            </w:r>
+          </w:p>
+        </w:tc>
+      </w:tr>
+      <w:tr>
+        <w:trPr>
+          <w:tblCellSpacing w:w="15" w:type="dxa"/>
+        </w:trPr>
+        <w:tc>
+          <w:tcPr>
+            <w:tcW w:w="601" w:type="dxa"/>
+            <w:vAlign w:val="center"/>
+            <w:hideMark/>
+          </w:tcPr>
+          <w:p>
+            <w:pPr>
+              <w:spacing w:after="160" w:line="259" w:lineRule="auto"/>
+              <w:jc w:val="left"/>
+            </w:pPr>
+            <w:r>
+              <w:t xml:space="preserve">[124]</w:t>
+            </w:r>
+          </w:p>
+        </w:tc>
+        <w:tc>
+          <w:tcPr>
+            <w:tcW w:w="0" w:type="auto"/>
+            <w:vAlign w:val="center"/>
+            <w:hideMark/>
+          </w:tcPr>
+          <w:p>
+            <w:pPr>
+              <w:spacing w:after="160" w:line="259" w:lineRule="auto"/>
+            </w:pPr>
+            <w:r>
+              <w:t xml:space="preserve">A. Christian, D. Therry, R. Ardiansyah, M. Y. Pusadan, Y. Y. Joefrie, and A. A. Kasim, “The Implementation and Analysis of The Proof of Work Consensus in Blockchain,” Advance Sustainable Science, Engineering and Technology 6, no. 1 (2024). doi: 10.26877/asset.v6i1.17878.</w:t>
+            </w:r>
+          </w:p>
+        </w:tc>
+      </w:tr>
+      <w:tr>
+        <w:trPr>
+          <w:tblCellSpacing w:w="15" w:type="dxa"/>
+        </w:trPr>
+        <w:tc>
+          <w:tcPr>
+            <w:tcW w:w="601" w:type="dxa"/>
+            <w:vAlign w:val="center"/>
+            <w:hideMark/>
+          </w:tcPr>
+          <w:p>
+            <w:pPr>
+              <w:spacing w:after="160" w:line="259" w:lineRule="auto"/>
+              <w:jc w:val="left"/>
+            </w:pPr>
+            <w:r>
+              <w:t xml:space="preserve">[125]</w:t>
+            </w:r>
+          </w:p>
+        </w:tc>
+        <w:tc>
+          <w:tcPr>
+            <w:tcW w:w="0" w:type="auto"/>
+            <w:vAlign w:val="center"/>
+            <w:hideMark/>
+          </w:tcPr>
+          <w:p>
+            <w:pPr>
+              <w:spacing w:after="160" w:line="259" w:lineRule="auto"/>
+            </w:pPr>
+            <w:r>
+              <w:t xml:space="preserve">P. Sethi, T. Nguyen, M. R. Chowdhury, S. Pirttikangas, and A. P. da Silva, “Fair consensus in blockchain with heterogeneous miners using reinforcement learning aided adaptive proof-of-work,” in 2024 IEEE 21st Consumer Communications &amp; Networking Conference (CCNC), pp. 937-942. IEEE, 2024. doi: 10.1109/CCNC51664.2024.10454844.</w:t>
+            </w:r>
+          </w:p>
+        </w:tc>
+      </w:tr>
+      <w:tr>
+        <w:trPr>
+          <w:tblCellSpacing w:w="15" w:type="dxa"/>
+        </w:trPr>
+        <w:tc>
+          <w:tcPr>
+            <w:tcW w:w="601" w:type="dxa"/>
+            <w:vAlign w:val="center"/>
+            <w:hideMark/>
+          </w:tcPr>
+          <w:p>
+            <w:pPr>
+              <w:spacing w:after="160" w:line="259" w:lineRule="auto"/>
+              <w:jc w:val="left"/>
+            </w:pPr>
+            <w:r>
+              <w:t xml:space="preserve">[126]</w:t>
+            </w:r>
+          </w:p>
+        </w:tc>
+        <w:tc>
+          <w:tcPr>
+            <w:tcW w:w="0" w:type="auto"/>
+            <w:vAlign w:val="center"/>
+            <w:hideMark/>
+          </w:tcPr>
+          <w:p>
+            <w:pPr>
+              <w:spacing w:after="160" w:line="259" w:lineRule="auto"/>
+            </w:pPr>
+            <w:r>
+              <w:t xml:space="preserve">J. Leng, M. Zhou, J. L. Zhao, Y. Huang, and Y. Bian, “Blockchain security: A survey of techniques and research directions,” IEEE Transactions on Services Computing, vol. 15, no. 4, pp. 2490–2510, 2020, doi: 10.1109/TSC.2020.3038641.</w:t>
+            </w:r>
+          </w:p>
+        </w:tc>
+      </w:tr>
+      <w:tr>
+        <w:trPr>
+          <w:tblCellSpacing w:w="15" w:type="dxa"/>
+        </w:trPr>
+        <w:tc>
+          <w:tcPr>
+            <w:tcW w:w="601" w:type="dxa"/>
+            <w:vAlign w:val="center"/>
+            <w:hideMark/>
+          </w:tcPr>
+          <w:p>
+            <w:pPr>
+              <w:spacing w:after="160" w:line="259" w:lineRule="auto"/>
+              <w:jc w:val="left"/>
+            </w:pPr>
+            <w:r>
+              <w:t xml:space="preserve">[127]</w:t>
+            </w:r>
+          </w:p>
+        </w:tc>
+        <w:tc>
+          <w:tcPr>
+            <w:tcW w:w="0" w:type="auto"/>
+            <w:vAlign w:val="center"/>
+            <w:hideMark/>
+          </w:tcPr>
+          <w:p>
+            <w:pPr>
+              <w:spacing w:after="160" w:line="259" w:lineRule="auto"/>
+            </w:pPr>
+            <w:r>
+              <w:t xml:space="preserve">M. Aldwairi and L. Tawalbeh, “Security Techniques for Intelligent Spam Sensing and Anomaly Detection in Online Social Platforms,” International Journal of Electrical and Computer Engineering, vol. 10, no. 1, pp. 275–287, 2020, doi: 10.11591/ijece.v10i1.pp275-287.</w:t>
+            </w:r>
+          </w:p>
+        </w:tc>
+      </w:tr>
+      <w:tr>
+        <w:trPr>
+          <w:tblCellSpacing w:w="15" w:type="dxa"/>
+        </w:trPr>
+        <w:tc>
+          <w:tcPr>
+            <w:tcW w:w="601" w:type="dxa"/>
+            <w:vAlign w:val="center"/>
+            <w:hideMark/>
+          </w:tcPr>
+          <w:p>
+            <w:pPr>
+              <w:spacing w:after="160" w:line="259" w:lineRule="auto"/>
+              <w:jc w:val="left"/>
+            </w:pPr>
+            <w:r>
+              <w:t xml:space="preserve">[128]</w:t>
+            </w:r>
+          </w:p>
+        </w:tc>
+        <w:tc>
+          <w:tcPr>
+            <w:tcW w:w="0" w:type="auto"/>
+            <w:vAlign w:val="center"/>
+            <w:hideMark/>
+          </w:tcPr>
+          <w:p>
+            <w:pPr>
+              <w:spacing w:after="160" w:line="259" w:lineRule="auto"/>
+            </w:pPr>
+            <w:r>
+              <w:t xml:space="preserve">C. P. Pascual Caceres et al., “Blockchain Architecture Based on Decentralised PoW Algorithm,” International Journal of Advanced Computer Science and Applications, vol. 14, no. 7, 2023, doi: 10.14569/IJACSA.2023.0140776.</w:t>
+            </w:r>
+          </w:p>
+        </w:tc>
+      </w:tr>
+      <w:tr>
+        <w:trPr>
+          <w:tblCellSpacing w:w="15" w:type="dxa"/>
+        </w:trPr>
+        <w:tc>
+          <w:tcPr>
+            <w:tcW w:w="601" w:type="dxa"/>
+            <w:vAlign w:val="center"/>
+            <w:hideMark/>
+          </w:tcPr>
+          <w:p>
+            <w:pPr>
+              <w:spacing w:after="160" w:line="259" w:lineRule="auto"/>
+              <w:jc w:val="left"/>
+            </w:pPr>
+            <w:r>
+              <w:t xml:space="preserve">[129]</w:t>
+            </w:r>
+          </w:p>
+        </w:tc>
+        <w:tc>
+          <w:tcPr>
+            <w:tcW w:w="0" w:type="auto"/>
+            <w:vAlign w:val="center"/>
+            <w:hideMark/>
+          </w:tcPr>
+          <w:p>
+            <w:pPr>
+              <w:spacing w:after="160" w:line="259" w:lineRule="auto"/>
+            </w:pPr>
+            <w:r>
+              <w:t xml:space="preserve">S. Prasanna, “Exploring the Architecture and Consensus Mechanisms of Hyperledger Fabric in Blockchain Technology,” JNAO, vol. 15, no. 1, 2024. [Online]. Available: https://jnao-nu.com/Vol.%2015,%20Issue.%2001,%20January-June%20:%202024/13.4.pdf</w:t>
+            </w:r>
+          </w:p>
+        </w:tc>
+      </w:tr>
+      <w:tr>
+        <w:trPr>
+          <w:tblCellSpacing w:w="15" w:type="dxa"/>
+        </w:trPr>
+        <w:tc>
+          <w:tcPr>
+            <w:tcW w:w="601" w:type="dxa"/>
+            <w:vAlign w:val="center"/>
+            <w:hideMark/>
+          </w:tcPr>
+          <w:p>
+            <w:pPr>
+              <w:spacing w:after="160" w:line="259" w:lineRule="auto"/>
+              <w:jc w:val="left"/>
+            </w:pPr>
+            <w:r>
+              <w:t xml:space="preserve">[130]</w:t>
+            </w:r>
+          </w:p>
+        </w:tc>
+        <w:tc>
+          <w:tcPr>
+            <w:tcW w:w="0" w:type="auto"/>
+            <w:vAlign w:val="center"/>
+            <w:hideMark/>
+          </w:tcPr>
+          <w:p>
+            <w:pPr>
+              <w:spacing w:after="160" w:line="259" w:lineRule="auto"/>
+            </w:pPr>
+            <w:r>
+              <w:t xml:space="preserve">L. Alboaie, S. Alboaie, and C. Calancea, “Optimal Byzantine Fault Tolerance Consensus Algorithm for Permissioned Systems,” in Proc. 2021 20th RoEduNet Conference: Networking in Education and Research, 2021, doi: 10.1109/RoEduNet54112.2021.9638279.</w:t>
+            </w:r>
+          </w:p>
+        </w:tc>
+      </w:tr>
+      <w:tr>
+        <w:trPr>
+          <w:tblCellSpacing w:w="15" w:type="dxa"/>
+        </w:trPr>
+        <w:tc>
+          <w:tcPr>
+            <w:tcW w:w="601" w:type="dxa"/>
+            <w:vAlign w:val="center"/>
+            <w:hideMark/>
+          </w:tcPr>
+          <w:p>
+            <w:pPr>
+              <w:spacing w:after="160" w:line="259" w:lineRule="auto"/>
+              <w:jc w:val="left"/>
+            </w:pPr>
+            <w:r>
+              <w:t xml:space="preserve">[131]</w:t>
+            </w:r>
+          </w:p>
+        </w:tc>
+        <w:tc>
+          <w:tcPr>
+            <w:tcW w:w="0" w:type="auto"/>
+            <w:vAlign w:val="center"/>
+            <w:hideMark/>
+          </w:tcPr>
+          <w:p>
+            <w:pPr>
+              <w:spacing w:after="160" w:line="259" w:lineRule="auto"/>
+            </w:pPr>
+            <w:r>
+              <w:t xml:space="preserve">H. Wang, G. Chen, Y. Zhang, and Z. Lin, “Multi-Certificate Attacks against Proof-of-Elapsed-Time and Their Countermeasures,” in NDSS. 2022, doi: 10.14722/ndss.2022.24158.</w:t>
+            </w:r>
+          </w:p>
+        </w:tc>
+      </w:tr>
+      <w:tr>
+        <w:trPr>
+          <w:tblCellSpacing w:w="15" w:type="dxa"/>
+        </w:trPr>
+        <w:tc>
+          <w:tcPr>
+            <w:tcW w:w="601" w:type="dxa"/>
+            <w:vAlign w:val="center"/>
+            <w:hideMark/>
+          </w:tcPr>
+          <w:p>
+            <w:pPr>
+              <w:spacing w:after="160" w:line="259" w:lineRule="auto"/>
+              <w:jc w:val="left"/>
+            </w:pPr>
+            <w:r>
+              <w:t xml:space="preserve">[132]</w:t>
+            </w:r>
+          </w:p>
+        </w:tc>
+        <w:tc>
+          <w:tcPr>
+            <w:tcW w:w="0" w:type="auto"/>
+            <w:vAlign w:val="center"/>
+            <w:hideMark/>
+          </w:tcPr>
+          <w:p>
+            <w:pPr>
+              <w:spacing w:after="160" w:line="259" w:lineRule="auto"/>
+            </w:pPr>
+            <w:r>
+              <w:t xml:space="preserve">K. Christidis and M. Devetsikiotis, “Blockchains and smart contracts for the internet of things,” IEEE access, vol. 4, pp. 2292–2303, 2016, doi: 10.1109/ACCESS.2016.2566339.</w:t>
+            </w:r>
+          </w:p>
+        </w:tc>
+      </w:tr>
+      <w:tr>
+        <w:trPr>
+          <w:tblCellSpacing w:w="15" w:type="dxa"/>
+        </w:trPr>
+        <w:tc>
+          <w:tcPr>
+            <w:tcW w:w="601" w:type="dxa"/>
+            <w:vAlign w:val="center"/>
+            <w:hideMark/>
+          </w:tcPr>
+          <w:p>
+            <w:pPr>
+              <w:spacing w:after="160" w:line="259" w:lineRule="auto"/>
+              <w:jc w:val="left"/>
+            </w:pPr>
+            <w:r>
+              <w:t xml:space="preserve">[133]</w:t>
+            </w:r>
+          </w:p>
+        </w:tc>
+        <w:tc>
+          <w:tcPr>
+            <w:tcW w:w="0" w:type="auto"/>
+            <w:vAlign w:val="center"/>
+            <w:hideMark/>
+          </w:tcPr>
+          <w:p>
+            <w:pPr>
+              <w:spacing w:after="160" w:line="259" w:lineRule="auto"/>
+            </w:pPr>
+            <w:r>
+              <w:t xml:space="preserve">M. P. Asadauskas, C. Cachin, and I. Amores Sesar, “PoET: An Eco-Friendly Alternative to PoW,” thesis, University of Bern, 2021. [Online]. Available: https://crypto.unibe.ch/archive/theses/2021.bsc.markus.asadauskas.pdf</w:t>
+            </w:r>
+          </w:p>
+        </w:tc>
+      </w:tr>
+      <w:tr>
+        <w:trPr>
+          <w:tblCellSpacing w:w="15" w:type="dxa"/>
+        </w:trPr>
+        <w:tc>
+          <w:tcPr>
+            <w:tcW w:w="601" w:type="dxa"/>
+            <w:vAlign w:val="center"/>
+            <w:hideMark/>
+          </w:tcPr>
+          <w:p>
+            <w:pPr>
+              <w:spacing w:after="160" w:line="259" w:lineRule="auto"/>
+              <w:jc w:val="left"/>
+            </w:pPr>
+            <w:r>
+              <w:t xml:space="preserve">[134]</w:t>
+            </w:r>
+          </w:p>
+        </w:tc>
+        <w:tc>
+          <w:tcPr>
+            <w:tcW w:w="0" w:type="auto"/>
+            <w:vAlign w:val="center"/>
+            <w:hideMark/>
+          </w:tcPr>
+          <w:p>
+            <w:pPr>
+              <w:spacing w:after="160" w:line="259" w:lineRule="auto"/>
+            </w:pPr>
+            <w:r>
+              <w:t xml:space="preserve">F. Raheman, “Blockchain in Logistics: A Protocol Selection Guide,” Accessed: Mar. 28, 2026. [Online]. Available: https://trace-horizon.eu/wp-content/uploads/2024/07/TRACE-Blockchain-in-Logistics-A-Protocol-Selection-Guide-White-paper.pdf</w:t>
+            </w:r>
+          </w:p>
+        </w:tc>
+      </w:tr>
+      <w:tr>
+        <w:trPr>
+          <w:tblCellSpacing w:w="15" w:type="dxa"/>
+        </w:trPr>
+        <w:tc>
+          <w:tcPr>
+            <w:tcW w:w="601" w:type="dxa"/>
+            <w:vAlign w:val="center"/>
+            <w:hideMark/>
+          </w:tcPr>
+          <w:p>
+            <w:pPr>
+              <w:spacing w:after="160" w:line="259" w:lineRule="auto"/>
+              <w:jc w:val="left"/>
+            </w:pPr>
+            <w:r>
+              <w:t xml:space="preserve">[135]</w:t>
+            </w:r>
+          </w:p>
+        </w:tc>
+        <w:tc>
+          <w:tcPr>
+            <w:tcW w:w="0" w:type="auto"/>
+            <w:vAlign w:val="center"/>
+            <w:hideMark/>
+          </w:tcPr>
+          <w:p>
+            <w:pPr>
+              <w:spacing w:after="160" w:line="259" w:lineRule="auto"/>
+            </w:pPr>
+            <w:r>
+              <w:t xml:space="preserve">M. Baboi, “Security of consensus mechanisms in blockchain,” Romanian Cyber Security Journal, vol. 5, no. 2, pp. 45–53, 2023, doi: 10.54851/v5i2y202305.</w:t>
+            </w:r>
+          </w:p>
+        </w:tc>
+      </w:tr>
+      <w:tr>
+        <w:trPr>
+          <w:tblCellSpacing w:w="15" w:type="dxa"/>
+        </w:trPr>
+        <w:tc>
+          <w:tcPr>
+            <w:tcW w:w="601" w:type="dxa"/>
+            <w:vAlign w:val="center"/>
+            <w:hideMark/>
+          </w:tcPr>
+          <w:p>
+            <w:pPr>
+              <w:spacing w:after="160" w:line="259" w:lineRule="auto"/>
+              <w:jc w:val="left"/>
+            </w:pPr>
+            <w:r>
+              <w:t xml:space="preserve">[136]</w:t>
+            </w:r>
+          </w:p>
+        </w:tc>
+        <w:tc>
+          <w:tcPr>
+            <w:tcW w:w="0" w:type="auto"/>
+            <w:vAlign w:val="center"/>
+            <w:hideMark/>
+          </w:tcPr>
+          <w:p>
+            <w:pPr>
+              <w:spacing w:after="160" w:line="259" w:lineRule="auto"/>
+            </w:pPr>
+            <w:r>
+              <w:t xml:space="preserve">H. Ju, M. Kumar, E. Valavi, and S. Aral, “Explaining Sustained Blockchain Decentralization with Quasi-Experiments: Resource Flexibility of Consensus Mechanisms,” arXiv preprint arXiv:2505.24663 (2025). doi: 10.48550/arXiv.2505.24663.</w:t>
+            </w:r>
+          </w:p>
+        </w:tc>
+      </w:tr>
+      <w:tr>
+        <w:trPr>
+          <w:tblCellSpacing w:w="15" w:type="dxa"/>
+        </w:trPr>
+        <w:tc>
+          <w:tcPr>
+            <w:tcW w:w="601" w:type="dxa"/>
+            <w:vAlign w:val="center"/>
+            <w:hideMark/>
+          </w:tcPr>
+          <w:p>
+            <w:pPr>
+              <w:spacing w:after="160" w:line="259" w:lineRule="auto"/>
+              <w:jc w:val="left"/>
+            </w:pPr>
+            <w:r>
+              <w:t xml:space="preserve">[137]</w:t>
+            </w:r>
+          </w:p>
+        </w:tc>
+        <w:tc>
+          <w:tcPr>
+            <w:tcW w:w="0" w:type="auto"/>
+            <w:vAlign w:val="center"/>
+            <w:hideMark/>
+          </w:tcPr>
+          <w:p>
+            <w:pPr>
+              <w:spacing w:after="160" w:line="259" w:lineRule="auto"/>
+            </w:pPr>
+            <w:r>
+              <w:t xml:space="preserve">M. A. Zarkesh, E. Dastani, B. Safaei, and A. Movaghar, “Edgelinker: Practical blockchain-based framework for healthcare fog applications to enhance security in edge-iot data communications,” in 2024 5th CPSSI International Symposium on Cyber-Physical Systems (Applications and Theory)(CPSAT), pp. 1-8. IEEE, 2024. doi: 10.1109/CPSAT64082.2024.10745419.</w:t>
+            </w:r>
+          </w:p>
+        </w:tc>
+      </w:tr>
+      <w:tr>
+        <w:trPr>
+          <w:tblCellSpacing w:w="15" w:type="dxa"/>
+        </w:trPr>
+        <w:tc>
+          <w:tcPr>
+            <w:tcW w:w="601" w:type="dxa"/>
+            <w:vAlign w:val="center"/>
+            <w:hideMark/>
+          </w:tcPr>
+          <w:p>
+            <w:pPr>
+              <w:spacing w:after="160" w:line="259" w:lineRule="auto"/>
+              <w:jc w:val="left"/>
+            </w:pPr>
+            <w:r>
+              <w:t xml:space="preserve">[138]</w:t>
+            </w:r>
+          </w:p>
+        </w:tc>
+        <w:tc>
+          <w:tcPr>
+            <w:tcW w:w="0" w:type="auto"/>
+            <w:vAlign w:val="center"/>
+            <w:hideMark/>
+          </w:tcPr>
+          <w:p>
+            <w:pPr>
+              <w:spacing w:after="160" w:line="259" w:lineRule="auto"/>
+            </w:pPr>
+            <w:r>
+              <w:t xml:space="preserve">N. A. Wahab, D. Zhang, N. F. Juniardi, and Y. Wong, “Advances in consortium chain scalability: A review of the practical byzantine fault tolerance consensus algorithm,” International Journal of Advanced Computer Science and Applications (IJACSA) 7 (2024). doi: 10.14569/IJACSA.2024.0150796.</w:t>
+            </w:r>
+          </w:p>
+        </w:tc>
+      </w:tr>
+      <w:tr>
+        <w:trPr>
+          <w:tblCellSpacing w:w="15" w:type="dxa"/>
+        </w:trPr>
+        <w:tc>
+          <w:tcPr>
+            <w:tcW w:w="601" w:type="dxa"/>
+            <w:vAlign w:val="center"/>
+            <w:hideMark/>
+          </w:tcPr>
+          <w:p>
+            <w:pPr>
+              <w:spacing w:after="160" w:line="259" w:lineRule="auto"/>
+              <w:jc w:val="left"/>
+            </w:pPr>
+            <w:r>
+              <w:t xml:space="preserve">[139]</w:t>
+            </w:r>
+          </w:p>
+        </w:tc>
+        <w:tc>
+          <w:tcPr>
+            <w:tcW w:w="0" w:type="auto"/>
+            <w:vAlign w:val="center"/>
+            <w:hideMark/>
+          </w:tcPr>
+          <w:p>
+            <w:pPr>
+              <w:spacing w:after="160" w:line="259" w:lineRule="auto"/>
+            </w:pPr>
+            <w:r>
+              <w:t xml:space="preserve">M. Castro and B. Liskov, “Practical byzantine fault tolerance and proactive recovery,” ACM Transactions on Computer Systems (TOCS), vol. 20, no. 4, pp. 398–461, 2002, doi: 10.1145/571637.571640.</w:t>
+            </w:r>
+          </w:p>
+        </w:tc>
+      </w:tr>
+      <w:tr>
+        <w:trPr>
+          <w:tblCellSpacing w:w="15" w:type="dxa"/>
+        </w:trPr>
+        <w:tc>
+          <w:tcPr>
+            <w:tcW w:w="601" w:type="dxa"/>
+            <w:vAlign w:val="center"/>
+            <w:hideMark/>
+          </w:tcPr>
+          <w:p>
+            <w:pPr>
+              <w:spacing w:after="160" w:line="259" w:lineRule="auto"/>
+              <w:jc w:val="left"/>
+            </w:pPr>
+            <w:r>
+              <w:t xml:space="preserve">[140]</w:t>
+            </w:r>
+          </w:p>
+        </w:tc>
+        <w:tc>
+          <w:tcPr>
+            <w:tcW w:w="0" w:type="auto"/>
+            <w:vAlign w:val="center"/>
+            <w:hideMark/>
+          </w:tcPr>
+          <w:p>
+            <w:pPr>
+              <w:spacing w:after="160" w:line="259" w:lineRule="auto"/>
+            </w:pPr>
+            <w:r>
+              <w:t xml:space="preserve">G. A. F. Rebello, G. F. Camilo, L. C. Guimaraes, L. A. C. de Souza, G. A. Thomaz, and O. C. M. Duarte, “A security and performance analysis of proof-based consensus protocols,” Annals of Telecommunications, vol. 77, no. 7, pp. 517–537, 2022, doi: 10.1007/S12243-021-00896-2.</w:t>
+            </w:r>
+          </w:p>
+        </w:tc>
+      </w:tr>
+      <w:tr>
+        <w:trPr>
+          <w:tblCellSpacing w:w="15" w:type="dxa"/>
+        </w:trPr>
+        <w:tc>
+          <w:tcPr>
+            <w:tcW w:w="601" w:type="dxa"/>
+            <w:vAlign w:val="center"/>
+            <w:hideMark/>
+          </w:tcPr>
+          <w:p>
+            <w:pPr>
+              <w:spacing w:after="160" w:line="259" w:lineRule="auto"/>
+              <w:jc w:val="left"/>
+            </w:pPr>
+            <w:r>
+              <w:t xml:space="preserve">[141]</w:t>
+            </w:r>
+          </w:p>
+        </w:tc>
+        <w:tc>
+          <w:tcPr>
+            <w:tcW w:w="0" w:type="auto"/>
+            <w:vAlign w:val="center"/>
+            <w:hideMark/>
+          </w:tcPr>
+          <w:p>
+            <w:pPr>
+              <w:spacing w:after="160" w:line="259" w:lineRule="auto"/>
+            </w:pPr>
+            <w:r>
+              <w:t xml:space="preserve">Z. Zhao, Z. Fang, X. Wang, X. Chen, H. Su, H. Xiao, and Y. Zhou, “Proof-of-learning with incentive security,” arXiv preprint arXiv:2404.09005 (2024). doi: 10.48550/arXiv.2404.09005.</w:t>
+            </w:r>
+          </w:p>
+        </w:tc>
+      </w:tr>
+      <w:tr>
+        <w:trPr>
+          <w:tblCellSpacing w:w="15" w:type="dxa"/>
+        </w:trPr>
+        <w:tc>
+          <w:tcPr>
+            <w:tcW w:w="601" w:type="dxa"/>
+            <w:vAlign w:val="center"/>
+            <w:hideMark/>
+          </w:tcPr>
+          <w:p>
+            <w:pPr>
+              <w:spacing w:after="160" w:line="259" w:lineRule="auto"/>
+              <w:jc w:val="left"/>
+            </w:pPr>
+            <w:r>
+              <w:t xml:space="preserve">[142]</w:t>
+            </w:r>
+          </w:p>
+        </w:tc>
+        <w:tc>
+          <w:tcPr>
+            <w:tcW w:w="0" w:type="auto"/>
+            <w:vAlign w:val="center"/>
+            <w:hideMark/>
+          </w:tcPr>
+          <w:p>
+            <w:pPr>
+              <w:spacing w:after="160" w:line="259" w:lineRule="auto"/>
+            </w:pPr>
+            <w:r>
+              <w:t xml:space="preserve">S. Deb, R. Raynor, and S. Kannan, “Stakesure: Proof of stake mechanisms with strong cryptoeconomic safety,” arXiv preprint arXiv:2401.05797 (2024). doi: 10.48550/arXiv.2401.05797.</w:t>
+            </w:r>
+          </w:p>
+        </w:tc>
+      </w:tr>
+      <w:tr>
+        <w:trPr>
+          <w:tblCellSpacing w:w="15" w:type="dxa"/>
+        </w:trPr>
+        <w:tc>
+          <w:tcPr>
+            <w:tcW w:w="601" w:type="dxa"/>
+            <w:vAlign w:val="center"/>
+            <w:hideMark/>
+          </w:tcPr>
+          <w:p>
+            <w:pPr>
+              <w:spacing w:after="160" w:line="259" w:lineRule="auto"/>
+              <w:jc w:val="left"/>
+            </w:pPr>
+            <w:r>
+              <w:t xml:space="preserve">[143]</w:t>
+            </w:r>
+          </w:p>
+        </w:tc>
+        <w:tc>
+          <w:tcPr>
+            <w:tcW w:w="0" w:type="auto"/>
+            <w:vAlign w:val="center"/>
+            <w:hideMark/>
+          </w:tcPr>
+          <w:p>
+            <w:pPr>
+              <w:spacing w:after="160" w:line="259" w:lineRule="auto"/>
+            </w:pPr>
+            <w:r>
+              <w:t xml:space="preserve">I. Abellán Álvarez, V. Gramlich, and J. Sedlmeir, “Unsealing the secrets of blockchain consensus: A systematic comparison of the formal security of proof-of-work and proof-of-stake,” in Proc. 39th ACM/SIGAPP symposium on applied computing, pp. 278-287. 2024. doi: 10.1145/3605098.3635970.</w:t>
+            </w:r>
+          </w:p>
+        </w:tc>
+      </w:tr>
+      <w:tr>
+        <w:trPr>
+          <w:tblCellSpacing w:w="15" w:type="dxa"/>
+        </w:trPr>
+        <w:tc>
+          <w:tcPr>
+            <w:tcW w:w="601" w:type="dxa"/>
+            <w:vAlign w:val="center"/>
+            <w:hideMark/>
+          </w:tcPr>
+          <w:p>
+            <w:pPr>
+              <w:spacing w:after="160" w:line="259" w:lineRule="auto"/>
+              <w:jc w:val="left"/>
+            </w:pPr>
+            <w:r>
+              <w:t xml:space="preserve">[144]</w:t>
+            </w:r>
+          </w:p>
+        </w:tc>
+        <w:tc>
+          <w:tcPr>
+            <w:tcW w:w="0" w:type="auto"/>
+            <w:vAlign w:val="center"/>
+            <w:hideMark/>
+          </w:tcPr>
+          <w:p>
+            <w:pPr>
+              <w:spacing w:after="160" w:line="259" w:lineRule="auto"/>
+            </w:pPr>
+            <w:r>
+              <w:t xml:space="preserve">W. Li, Q. Zhang, S. Deng, B. Zhou, B. Wang, and J. Cao, “Q-Learning Improved Lightweight Consensus Algorithm for Blockchain-Structured Internet of Things,” IEEE Internet of Things Journal, vol. 10, no. 24, 2023, doi: 10.1109/JIOT.2023.3294265.</w:t>
+            </w:r>
+          </w:p>
+        </w:tc>
+      </w:tr>
+      <w:tr>
+        <w:trPr>
+          <w:tblCellSpacing w:w="15" w:type="dxa"/>
+        </w:trPr>
+        <w:tc>
+          <w:tcPr>
+            <w:tcW w:w="601" w:type="dxa"/>
+            <w:vAlign w:val="center"/>
+            <w:hideMark/>
+          </w:tcPr>
+          <w:p>
+            <w:pPr>
+              <w:spacing w:after="160" w:line="259" w:lineRule="auto"/>
+              <w:jc w:val="left"/>
+            </w:pPr>
+            <w:r>
+              <w:t xml:space="preserve">[145]</w:t>
+            </w:r>
+          </w:p>
+        </w:tc>
+        <w:tc>
+          <w:tcPr>
+            <w:tcW w:w="0" w:type="auto"/>
+            <w:vAlign w:val="center"/>
+            <w:hideMark/>
+          </w:tcPr>
+          <w:p>
+            <w:pPr>
+              <w:spacing w:after="160" w:line="259" w:lineRule="auto"/>
+            </w:pPr>
+            <w:r>
+              <w:t xml:space="preserve">S. Y. Fayi and Z. Sheng, “A survey of security, privacy and trust issues in vehicular computation offloading and their solutions using blockchain,” Open Research Europe, vol. 3, Art. no. 110, 2023, doi: 10.12688/openreseurope.16189.2.</w:t>
+            </w:r>
+          </w:p>
+        </w:tc>
+      </w:tr>
+      <w:tr>
+        <w:trPr>
+          <w:tblCellSpacing w:w="15" w:type="dxa"/>
+        </w:trPr>
+        <w:tc>
+          <w:tcPr>
+            <w:tcW w:w="601" w:type="dxa"/>
+            <w:vAlign w:val="center"/>
+            <w:hideMark/>
+          </w:tcPr>
+          <w:p>
+            <w:pPr>
+              <w:spacing w:after="160" w:line="259" w:lineRule="auto"/>
+              <w:jc w:val="left"/>
+            </w:pPr>
+            <w:r>
+              <w:t xml:space="preserve">[146]</w:t>
+            </w:r>
+          </w:p>
+        </w:tc>
+        <w:tc>
+          <w:tcPr>
+            <w:tcW w:w="0" w:type="auto"/>
+            <w:vAlign w:val="center"/>
+            <w:hideMark/>
+          </w:tcPr>
+          <w:p>
+            <w:pPr>
+              <w:spacing w:after="160" w:line="259" w:lineRule="auto"/>
+            </w:pPr>
+            <w:r>
+              <w:t xml:space="preserve">S. M. Umran, S. Lu, Z. A. Abduljabbar, J. Zhu, and J. Wu, “Secure data of industrial internet of things in a cement factory based on a Blockchain technology,” Applied Sciences, vol. 11, no. 14, Art. no. 6376, 2021, doi: 10.3390/app11146376.</w:t>
+            </w:r>
+          </w:p>
+        </w:tc>
+      </w:tr>
+      <w:tr>
+        <w:trPr>
+          <w:tblCellSpacing w:w="15" w:type="dxa"/>
+        </w:trPr>
+        <w:tc>
+          <w:tcPr>
+            <w:tcW w:w="601" w:type="dxa"/>
+            <w:vAlign w:val="center"/>
+            <w:hideMark/>
+          </w:tcPr>
+          <w:p>
+            <w:pPr>
+              <w:spacing w:after="160" w:line="259" w:lineRule="auto"/>
+              <w:jc w:val="left"/>
+            </w:pPr>
+            <w:r>
+              <w:t xml:space="preserve">[147]</w:t>
+            </w:r>
+          </w:p>
+        </w:tc>
+        <w:tc>
+          <w:tcPr>
+            <w:tcW w:w="0" w:type="auto"/>
+            <w:vAlign w:val="center"/>
+            <w:hideMark/>
+          </w:tcPr>
+          <w:p>
+            <w:pPr>
+              <w:spacing w:after="160" w:line="259" w:lineRule="auto"/>
+            </w:pPr>
+            <w:r>
+              <w:t xml:space="preserve">Q. Wang, R. Li, Q. Wang, S. Chen, and Y. Xiang, “Exploring unfairness on proof of authority: Order manipulation attacks and remedies,” in Proc. 2022 ACM on Asia Conference on Computer and Communications Security, pp. 123-137. 2022. doi: 10.1145/3488932.3517394.</w:t>
+            </w:r>
+          </w:p>
+        </w:tc>
+      </w:tr>
+      <w:tr>
+        <w:trPr>
+          <w:tblCellSpacing w:w="15" w:type="dxa"/>
+        </w:trPr>
+        <w:tc>
+          <w:tcPr>
+            <w:tcW w:w="601" w:type="dxa"/>
+            <w:vAlign w:val="center"/>
+            <w:hideMark/>
+          </w:tcPr>
+          <w:p>
+            <w:pPr>
+              <w:spacing w:after="160" w:line="259" w:lineRule="auto"/>
+              <w:jc w:val="left"/>
+            </w:pPr>
+            <w:r>
+              <w:t xml:space="preserve">[148]</w:t>
+            </w:r>
+          </w:p>
+        </w:tc>
+        <w:tc>
+          <w:tcPr>
+            <w:tcW w:w="0" w:type="auto"/>
+            <w:vAlign w:val="center"/>
+            <w:hideMark/>
+          </w:tcPr>
+          <w:p>
+            <w:pPr>
+              <w:spacing w:after="160" w:line="259" w:lineRule="auto"/>
+            </w:pPr>
+            <w:r>
+              <w:t xml:space="preserve">R. Sytnyk and V. Hnatushenko, “Study of consensus algorithms in blockchain networks in the design of information systems,” Міжнародна науково-технічна конференція Інформаційні технології в металургії та машинобудуванні (2024): 479-484. doi: 10.34185/1991-7848.itmm.2024.01.092.</w:t>
+            </w:r>
+          </w:p>
+        </w:tc>
+      </w:tr>
+      <w:tr>
+        <w:trPr>
+          <w:tblCellSpacing w:w="15" w:type="dxa"/>
+        </w:trPr>
+        <w:tc>
+          <w:tcPr>
+            <w:tcW w:w="601" w:type="dxa"/>
+            <w:vAlign w:val="center"/>
+            <w:hideMark/>
+          </w:tcPr>
+          <w:p>
+            <w:pPr>
+              <w:spacing w:after="160" w:line="259" w:lineRule="auto"/>
+              <w:jc w:val="left"/>
+            </w:pPr>
+            <w:r>
+              <w:t xml:space="preserve">[149]</w:t>
+            </w:r>
+          </w:p>
+        </w:tc>
+        <w:tc>
+          <w:tcPr>
+            <w:tcW w:w="0" w:type="auto"/>
+            <w:vAlign w:val="center"/>
+            <w:hideMark/>
+          </w:tcPr>
+          <w:p>
+            <w:pPr>
+              <w:spacing w:after="160" w:line="259" w:lineRule="auto"/>
+            </w:pPr>
+            <w:r>
+              <w:t xml:space="preserve">M. Anus and A. Bin Ngadi, “Comparison Analysis of Blockchain Consensus Algorithms in Decentralized Public Environment: A Review,” Asia Proceedings of Social Sciences, 2024, doi: 10.31580/jm7sfp03.</w:t>
+            </w:r>
+          </w:p>
+        </w:tc>
+      </w:tr>
+      <w:tr>
+        <w:trPr>
+          <w:tblCellSpacing w:w="15" w:type="dxa"/>
+        </w:trPr>
+        <w:tc>
+          <w:tcPr>
+            <w:tcW w:w="601" w:type="dxa"/>
+            <w:vAlign w:val="center"/>
+            <w:hideMark/>
+          </w:tcPr>
+          <w:p>
+            <w:pPr>
+              <w:spacing w:after="160" w:line="259" w:lineRule="auto"/>
+              <w:jc w:val="left"/>
+            </w:pPr>
+            <w:r>
+              <w:t xml:space="preserve">[150]</w:t>
+            </w:r>
+          </w:p>
+        </w:tc>
+        <w:tc>
+          <w:tcPr>
+            <w:tcW w:w="0" w:type="auto"/>
+            <w:vAlign w:val="center"/>
+            <w:hideMark/>
+          </w:tcPr>
+          <w:p>
+            <w:pPr>
+              <w:spacing w:after="160" w:line="259" w:lineRule="auto"/>
+            </w:pPr>
+            <w:r>
+              <w:t xml:space="preserve">R. M. Ashu and S. Zafar, “Revolutionary IoT and Big Data in Healthcare: A Predictive Model Analysis,” ICIDSSD, vol. 2020, Art. no. 61, 2021, doi: 10.4108/eai.27-2-2020.2303135.</w:t>
+            </w:r>
+          </w:p>
+        </w:tc>
+      </w:tr>
+      <w:tr>
+        <w:trPr>
+          <w:tblCellSpacing w:w="15" w:type="dxa"/>
+        </w:trPr>
+        <w:tc>
+          <w:tcPr>
+            <w:tcW w:w="601" w:type="dxa"/>
+            <w:vAlign w:val="center"/>
+            <w:hideMark/>
+          </w:tcPr>
+          <w:p>
+            <w:pPr>
+              <w:spacing w:after="160" w:line="259" w:lineRule="auto"/>
+              <w:jc w:val="left"/>
+            </w:pPr>
+            <w:r>
+              <w:t xml:space="preserve">[151]</w:t>
+            </w:r>
+          </w:p>
+        </w:tc>
+        <w:tc>
+          <w:tcPr>
+            <w:tcW w:w="0" w:type="auto"/>
+            <w:vAlign w:val="center"/>
+            <w:hideMark/>
+          </w:tcPr>
+          <w:p>
+            <w:pPr>
+              <w:spacing w:after="160" w:line="259" w:lineRule="auto"/>
+            </w:pPr>
+            <w:r>
+              <w:t xml:space="preserve">A. Hassan, M. I. Ali, R. Ahammed, M. M. Khan, N. Alsufyani, and A. Alsufyani, “Secured insurance framework using blockchain and smart contract,” Scientific Programming, vol. 2021, no. 1, Art. no. 6787406, 2021, doi: 10.1155/2021/6787406.</w:t>
+            </w:r>
+          </w:p>
+        </w:tc>
+      </w:tr>
+      <w:tr>
+        <w:trPr>
+          <w:tblCellSpacing w:w="15" w:type="dxa"/>
+        </w:trPr>
+        <w:tc>
+          <w:tcPr>
+            <w:tcW w:w="601" w:type="dxa"/>
+            <w:vAlign w:val="center"/>
+            <w:hideMark/>
+          </w:tcPr>
+          <w:p>
+            <w:pPr>
+              <w:spacing w:after="160" w:line="259" w:lineRule="auto"/>
+              <w:jc w:val="left"/>
+            </w:pPr>
+            <w:r>
+              <w:t xml:space="preserve">[152]</w:t>
+            </w:r>
+          </w:p>
+        </w:tc>
+        <w:tc>
+          <w:tcPr>
+            <w:tcW w:w="0" w:type="auto"/>
+            <w:vAlign w:val="center"/>
+            <w:hideMark/>
+          </w:tcPr>
+          <w:p>
+            <w:pPr>
+              <w:spacing w:after="160" w:line="259" w:lineRule="auto"/>
+            </w:pPr>
+            <w:r>
+              <w:t xml:space="preserve">M. Rukhiran, S. Boonsong, and P. Netinant, “Sustainable optimizing performance and energy efficiency in proof of work blockchain: A multilinear regression approach,” Sustainability, vol. 16, no. 4, Art. no. 1519, 2024, doi: 10.3390/su16041519.</w:t>
+            </w:r>
+          </w:p>
+        </w:tc>
+      </w:tr>
+      <w:tr>
+        <w:trPr>
+          <w:tblCellSpacing w:w="15" w:type="dxa"/>
+        </w:trPr>
+        <w:tc>
+          <w:tcPr>
+            <w:tcW w:w="601" w:type="dxa"/>
+            <w:vAlign w:val="center"/>
+            <w:hideMark/>
+          </w:tcPr>
+          <w:p>
+            <w:pPr>
+              <w:spacing w:after="160" w:line="259" w:lineRule="auto"/>
+              <w:jc w:val="left"/>
+            </w:pPr>
+            <w:r>
+              <w:t xml:space="preserve">[153]</w:t>
+            </w:r>
+          </w:p>
+        </w:tc>
+        <w:tc>
+          <w:tcPr>
+            <w:tcW w:w="0" w:type="auto"/>
+            <w:vAlign w:val="center"/>
+            <w:hideMark/>
+          </w:tcPr>
+          <w:p>
+            <w:pPr>
+              <w:spacing w:after="160" w:line="259" w:lineRule="auto"/>
+            </w:pPr>
+            <w:r>
+              <w:t xml:space="preserve">M. Bowman, D. Das, A. Mandal, and H. Montgomery, “On Elapsed Time Consensus Protocols,” in Applied Cryptography and Network Security Workshops (Lecture Notes in Computer Science), Springer, 2022, doi: 10.1007/978-3-030-92518-5_25.</w:t>
+            </w:r>
+          </w:p>
+        </w:tc>
+      </w:tr>
+      <w:tr>
+        <w:trPr>
+          <w:tblCellSpacing w:w="15" w:type="dxa"/>
+        </w:trPr>
+        <w:tc>
+          <w:tcPr>
+            <w:tcW w:w="601" w:type="dxa"/>
+            <w:vAlign w:val="center"/>
+            <w:hideMark/>
+          </w:tcPr>
+          <w:p>
+            <w:pPr>
+              <w:spacing w:after="160" w:line="259" w:lineRule="auto"/>
+              <w:jc w:val="left"/>
+            </w:pPr>
+            <w:r>
+              <w:t xml:space="preserve">[154]</w:t>
+            </w:r>
+          </w:p>
+        </w:tc>
+        <w:tc>
+          <w:tcPr>
+            <w:tcW w:w="0" w:type="auto"/>
+            <w:vAlign w:val="center"/>
+            <w:hideMark/>
+          </w:tcPr>
+          <w:p>
+            <w:pPr>
+              <w:spacing w:after="160" w:line="259" w:lineRule="auto"/>
+            </w:pPr>
+            <w:r>
+              <w:t xml:space="preserve">J. Bonneau and N. Heninger, Eds., Financial Cryptography and Data Security: 24th International Conference (FC 2020), Revised Selected Papers (Lecture Notes in Computer Science), Springer, 2020, doi: 10.1007/978-3-030-51280-4.</w:t>
+            </w:r>
+          </w:p>
+        </w:tc>
+      </w:tr>
+      <w:tr>
+        <w:trPr>
+          <w:tblCellSpacing w:w="15" w:type="dxa"/>
+        </w:trPr>
+        <w:tc>
+          <w:tcPr>
+            <w:tcW w:w="601" w:type="dxa"/>
+            <w:vAlign w:val="center"/>
+            <w:hideMark/>
+          </w:tcPr>
+          <w:p>
+            <w:pPr>
+              <w:spacing w:after="160" w:line="259" w:lineRule="auto"/>
+              <w:jc w:val="left"/>
+            </w:pPr>
+            <w:r>
+              <w:t xml:space="preserve">[155]</w:t>
+            </w:r>
+          </w:p>
+        </w:tc>
+        <w:tc>
+          <w:tcPr>
+            <w:tcW w:w="0" w:type="auto"/>
+            <w:vAlign w:val="center"/>
+            <w:hideMark/>
+          </w:tcPr>
+          <w:p>
+            <w:pPr>
+              <w:spacing w:after="160" w:line="259" w:lineRule="auto"/>
+            </w:pPr>
+            <w:r>
+              <w:t xml:space="preserve">C. Brian, “Burning Up: A Global History of Fossil Fuel Consumption,” pp. 700–702, 2020, doi: 10.2307/j.ctv4ncp7q.</w:t>
             </w:r>
           </w:p>
         </w:tc>

</xml_diff>

<commit_message>
Rebuild chapter-5 diagram insertion for Word compatibility
The python-docx-saved version failed to open in Word. Rebuilt the
insertion with pure lxml surgery on the last known-good package: only
word/document.xml and its rels change, the four PNGs are added, and
each inline drawing clones the XML structure of an existing
Word-authored image in the same document. Schema validation passes
and citations [1]-[148] are verified intact.

Co-Authored-By: Claude Fable 5 <noreply@anthropic.com>
Claude-Session: https://claude.ai/code/session_01Le33924H9ectETDkPd9jAv
</commit_message>
<xml_diff>
--- a/docs/citation-correction/PhD-thesis-Raed-Rasheed-IEEE-Citations-Corrected.docx
+++ b/docs/citation-correction/PhD-thesis-Raed-Rasheed-IEEE-Citations-Corrected.docx
@@ -38628,7 +38628,7 @@
           <w:color w:val="FF0000"/>
           <w:u w:val="single"/>
         </w:rPr>
-        <w:t>Figure 5.1 illustrates a complete PoCol consensus round in which one registered miner (Miner C) is inactive. All three miners read the same registered miner set from their local ledgers, build identical candidate block headers, and locally evaluate the deterministic nonce distribution function to obtain their disjoint nonce ranges. While Miner A and Miner B perform the collaborative Proof-of-Work search over their assigned ranges, the range assigned to Miner C remains unexplored, which is equivalent to a temporary loss of effective hash power as discussed in Section 5.6.5. The figure also shows that the winning miner may still include the inactive miner in the reward distribution if it remains registered, that all nodes verify the nonce-range usage and reward correctness before committing the block, and that a new round with a modified candidate header is started when assigned ranges are exhausted without success.</w:t>
+        <w:t xml:space="preserve">Figure 5.1 illustrates a complete PoCol consensus round in which one registered miner (Miner C) is inactive. All three miners read the same registered miner set from their local ledgers, build identical candidate block headers, and locally evaluate the deterministic nonce distribution function to obtain their disjoint nonce ranges. While Miner A and Miner B perform the collaborative Proof-of-Work search over their assigned ranges, the range assigned to Miner C remains unexplored, which is equivalent to a temporary loss of effective hash power as discussed in Section 5.6.5. The figure also shows that the winning miner may still include the inactive miner in the reward distribution if it remains registered, that all nodes verify the nonce-range usage and reward correctness before committing the block, and that a new round with a modified candidate header is started when assigned ranges are exhausted without success.</w:t>
       </w:r>
     </w:p>
     <w:p>
@@ -38637,31 +38637,50 @@
       </w:pPr>
       <w:r>
         <w:drawing>
-          <wp:inline xmlns:a="http://schemas.openxmlformats.org/drawingml/2006/main" xmlns:pic="http://schemas.openxmlformats.org/drawingml/2006/picture">
+          <wp:inline distT="0" distB="0" distL="0" distR="0" wp14:anchorId="29C7B066" wp14:editId="075D8F13">
             <wp:extent cx="5577840" cy="7450086"/>
-            <wp:docPr id="1073708021" name="Picture 1073708021"/>
+            <wp:effectExtent l="0" t="0" r="0" b="0"/>
+            <wp:docPr id="910000" name="PoCol Figure 5.1" descr="PoCol Figure 5.1"/>
             <wp:cNvGraphicFramePr>
-              <a:graphicFrameLocks noChangeAspect="1"/>
+              <a:graphicFrameLocks xmlns:a="http://schemas.openxmlformats.org/drawingml/2006/main" noChangeAspect="1"/>
             </wp:cNvGraphicFramePr>
-            <a:graphic>
+            <a:graphic xmlns:a="http://schemas.openxmlformats.org/drawingml/2006/main">
               <a:graphicData uri="http://schemas.openxmlformats.org/drawingml/2006/picture">
-                <pic:pic>
+                <pic:pic xmlns:pic="http://schemas.openxmlformats.org/drawingml/2006/picture">
                   <pic:nvPicPr>
-                    <pic:cNvPr id="0" name="fig_inactive.png"/>
-                    <pic:cNvPicPr/>
+                    <pic:cNvPr id="910000" name="PoCol Figure 5.1" descr="C:\Users\hp\Desktop\iug640x480.jpg"/>
+                    <pic:cNvPicPr>
+                      <a:picLocks noChangeAspect="1" noChangeArrowheads="1"/>
+                    </pic:cNvPicPr>
                   </pic:nvPicPr>
                   <pic:blipFill>
-                    <a:blip r:embed="rId23"/>
+                    <a:blip r:embed="rId9001" cstate="print">
+                      <a:extLst>
+                        <a:ext uri="{28A0092B-C50C-407E-A947-70E740481C1C}">
+                          <a14:useLocalDpi xmlns:a14="http://schemas.microsoft.com/office/drawing/2010/main" val="0"/>
+                        </a:ext>
+                      </a:extLst>
+                    </a:blip>
+                    <a:srcRect/>
                     <a:stretch>
                       <a:fillRect/>
                     </a:stretch>
                   </pic:blipFill>
-                  <pic:spPr>
+                  <pic:spPr bwMode="auto">
                     <a:xfrm>
                       <a:off x="0" y="0"/>
                       <a:ext cx="5577840" cy="7450086"/>
                     </a:xfrm>
-                    <a:prstGeom prst="rect"/>
+                    <a:prstGeom prst="rect">
+                      <a:avLst/>
+                    </a:prstGeom>
+                    <a:noFill/>
+                    <a:ln w="9525">
+                      <a:noFill/>
+                      <a:miter lim="800000"/>
+                      <a:headEnd/>
+                      <a:tailEnd/>
+                    </a:ln>
                   </pic:spPr>
                 </pic:pic>
               </a:graphicData>
@@ -38679,7 +38698,7 @@
           <w:color w:val="FF0000"/>
           <w:u w:val="single"/>
         </w:rPr>
-        <w:t>Figure 5.1: PoCol consensus round with unused nonce space due to an inactive miner.</w:t>
+        <w:t xml:space="preserve">Figure 5.1: PoCol consensus round with unused nonce space due to an inactive miner.</w:t>
       </w:r>
     </w:p>
     <w:p>
@@ -38874,7 +38893,7 @@
           <w:color w:val="FF0000"/>
           <w:u w:val="single"/>
         </w:rPr>
-        <w:t>Figure 5.2 presents the complete genesis round of PoCol as described in Sections 5.7.1–5.7.4. The sequence begins with the bootstrap registration phase, in which Miner A stores its own registration locally and then admits Miner B and Miner C into the registered miner set, confirming the updated set to each joining miner. After a client submits a transaction that is validated and relayed to all miners, every miner reads the genesis hash, builds an identical round-0 candidate block header, computes the same round seed from the fixed domain separator, and applies the nonce distribution function to derive its ticket, its index in the ordered miner list, and its assigned nonce range. The collaborative search then proceeds in parallel until Miner B finds a winning nonce, constructs the genesis block with reward outputs for all registered miners, and broadcasts it; all miners verify the proof of work, the nonce-range correctness, and the reward distribution before appending block B0 to their local ledgers and clearing their mempools.</w:t>
+        <w:t xml:space="preserve">Figure 5.2 presents the complete genesis round of PoCol as described in Sections 5.7.1–5.7.4. The sequence begins with the bootstrap registration phase, in which Miner A stores its own registration locally and then admits Miner B and Miner C into the registered miner set, confirming the updated set to each joining miner. After a client submits a transaction that is validated and relayed to all miners, every miner reads the genesis hash, builds an identical round-0 candidate block header, computes the same round seed from the fixed domain separator, and applies the nonce distribution function to derive its ticket, its index in the ordered miner list, and its assigned nonce range. The collaborative search then proceeds in parallel until Miner B finds a winning nonce, constructs the genesis block with reward outputs for all registered miners, and broadcasts it; all miners verify the proof of work, the nonce-range correctness, and the reward distribution before appending block B0 to their local ledgers and clearing their mempools.</w:t>
       </w:r>
     </w:p>
     <w:p>
@@ -38883,31 +38902,50 @@
       </w:pPr>
       <w:r>
         <w:drawing>
-          <wp:inline xmlns:a="http://schemas.openxmlformats.org/drawingml/2006/main" xmlns:pic="http://schemas.openxmlformats.org/drawingml/2006/picture">
-            <wp:extent cx="4861454" cy="7680960"/>
-            <wp:docPr id="1073708022" name="Picture 1073708022"/>
+          <wp:inline distT="0" distB="0" distL="0" distR="0" wp14:anchorId="29C7B066" wp14:editId="075D8F13">
+            <wp:extent cx="4861453" cy="7680960"/>
+            <wp:effectExtent l="0" t="0" r="0" b="0"/>
+            <wp:docPr id="910001" name="PoCol Figure 5.2" descr="PoCol Figure 5.2"/>
             <wp:cNvGraphicFramePr>
-              <a:graphicFrameLocks noChangeAspect="1"/>
+              <a:graphicFrameLocks xmlns:a="http://schemas.openxmlformats.org/drawingml/2006/main" noChangeAspect="1"/>
             </wp:cNvGraphicFramePr>
-            <a:graphic>
+            <a:graphic xmlns:a="http://schemas.openxmlformats.org/drawingml/2006/main">
               <a:graphicData uri="http://schemas.openxmlformats.org/drawingml/2006/picture">
-                <pic:pic>
+                <pic:pic xmlns:pic="http://schemas.openxmlformats.org/drawingml/2006/picture">
                   <pic:nvPicPr>
-                    <pic:cNvPr id="0" name="fig_genesis.png"/>
-                    <pic:cNvPicPr/>
+                    <pic:cNvPr id="910001" name="PoCol Figure 5.2" descr="C:\Users\hp\Desktop\iug640x480.jpg"/>
+                    <pic:cNvPicPr>
+                      <a:picLocks noChangeAspect="1" noChangeArrowheads="1"/>
+                    </pic:cNvPicPr>
                   </pic:nvPicPr>
                   <pic:blipFill>
-                    <a:blip r:embed="rId24"/>
+                    <a:blip r:embed="rId9011" cstate="print">
+                      <a:extLst>
+                        <a:ext uri="{28A0092B-C50C-407E-A947-70E740481C1C}">
+                          <a14:useLocalDpi xmlns:a14="http://schemas.microsoft.com/office/drawing/2010/main" val="0"/>
+                        </a:ext>
+                      </a:extLst>
+                    </a:blip>
+                    <a:srcRect/>
                     <a:stretch>
                       <a:fillRect/>
                     </a:stretch>
                   </pic:blipFill>
-                  <pic:spPr>
+                  <pic:spPr bwMode="auto">
                     <a:xfrm>
                       <a:off x="0" y="0"/>
-                      <a:ext cx="4861454" cy="7680960"/>
+                      <a:ext cx="4861453" cy="7680960"/>
                     </a:xfrm>
-                    <a:prstGeom prst="rect"/>
+                    <a:prstGeom prst="rect">
+                      <a:avLst/>
+                    </a:prstGeom>
+                    <a:noFill/>
+                    <a:ln w="9525">
+                      <a:noFill/>
+                      <a:miter lim="800000"/>
+                      <a:headEnd/>
+                      <a:tailEnd/>
+                    </a:ln>
                   </pic:spPr>
                 </pic:pic>
               </a:graphicData>
@@ -38925,7 +38963,7 @@
           <w:color w:val="FF0000"/>
           <w:u w:val="single"/>
         </w:rPr>
-        <w:t>Figure 5.2: PoCol consensus genesis round (round 0), including miner registration, transaction submission, collaborative nonce search, and commitment of the genesis block.</w:t>
+        <w:t xml:space="preserve">Figure 5.2: PoCol consensus genesis round (round 0), including miner registration, transaction submission, collaborative nonce search, and commitment of the genesis block.</w:t>
       </w:r>
     </w:p>
     <w:p>
@@ -40635,7 +40673,7 @@
           <w:color w:val="FF0000"/>
           <w:u w:val="single"/>
         </w:rPr>
-        <w:t>Figure 5.3 details the reward distribution mechanism of Section 5.9 from the perspective of the winning miner (Miner B) in an arbitrary round r. After detecting a nonce that satisfies the difficulty target, the winner constructs a provisional block, reads the registered miner set M_r from its ledger view, and applies the reward distribution function f_r to compute a share for every registered miner such that the shares sum to the block subsidy plus the collected transaction fees. The resulting reward distribution transaction T_reward(r), with one output per registered miner, is inserted into the block before broadcasting. The figure highlights the verification rules of Section 5.9.2: every receiving miner independently checks that the beneficiaries match M_r exactly, that each share equals the value prescribed by f_r, that the outputs sum to R_tot(r), and that no value is created or destroyed, before the block is committed and all local balances are updated for the next round.</w:t>
+        <w:t xml:space="preserve">Figure 5.3 details the reward distribution mechanism of Section 5.9 from the perspective of the winning miner (Miner B) in an arbitrary round r. After detecting a nonce that satisfies the difficulty target, the winner constructs a provisional block, reads the registered miner set M_r from its ledger view, and applies the reward distribution function f_r to compute a share for every registered miner such that the shares sum to the block subsidy plus the collected transaction fees. The resulting reward distribution transaction T_reward(r), with one output per registered miner, is inserted into the block before broadcasting. The figure highlights the verification rules of Section 5.9.2: every receiving miner independently checks that the beneficiaries match M_r exactly, that each share equals the value prescribed by f_r, that the outputs sum to R_tot(r), and that no value is created or destroyed, before the block is committed and all local balances are updated for the next round.</w:t>
       </w:r>
     </w:p>
     <w:p>
@@ -40644,31 +40682,50 @@
       </w:pPr>
       <w:r>
         <w:drawing>
-          <wp:inline xmlns:a="http://schemas.openxmlformats.org/drawingml/2006/main" xmlns:pic="http://schemas.openxmlformats.org/drawingml/2006/picture">
-            <wp:extent cx="5577840" cy="6304518"/>
-            <wp:docPr id="1073708023" name="Picture 1073708023"/>
+          <wp:inline distT="0" distB="0" distL="0" distR="0" wp14:anchorId="29C7B066" wp14:editId="075D8F13">
+            <wp:extent cx="5577840" cy="6304517"/>
+            <wp:effectExtent l="0" t="0" r="0" b="0"/>
+            <wp:docPr id="910002" name="PoCol Figure 5.3" descr="PoCol Figure 5.3"/>
             <wp:cNvGraphicFramePr>
-              <a:graphicFrameLocks noChangeAspect="1"/>
+              <a:graphicFrameLocks xmlns:a="http://schemas.openxmlformats.org/drawingml/2006/main" noChangeAspect="1"/>
             </wp:cNvGraphicFramePr>
-            <a:graphic>
+            <a:graphic xmlns:a="http://schemas.openxmlformats.org/drawingml/2006/main">
               <a:graphicData uri="http://schemas.openxmlformats.org/drawingml/2006/picture">
-                <pic:pic>
+                <pic:pic xmlns:pic="http://schemas.openxmlformats.org/drawingml/2006/picture">
                   <pic:nvPicPr>
-                    <pic:cNvPr id="0" name="fig_reward.png"/>
-                    <pic:cNvPicPr/>
+                    <pic:cNvPr id="910002" name="PoCol Figure 5.3" descr="C:\Users\hp\Desktop\iug640x480.jpg"/>
+                    <pic:cNvPicPr>
+                      <a:picLocks noChangeAspect="1" noChangeArrowheads="1"/>
+                    </pic:cNvPicPr>
                   </pic:nvPicPr>
                   <pic:blipFill>
-                    <a:blip r:embed="rId25"/>
+                    <a:blip r:embed="rId9021" cstate="print">
+                      <a:extLst>
+                        <a:ext uri="{28A0092B-C50C-407E-A947-70E740481C1C}">
+                          <a14:useLocalDpi xmlns:a14="http://schemas.microsoft.com/office/drawing/2010/main" val="0"/>
+                        </a:ext>
+                      </a:extLst>
+                    </a:blip>
+                    <a:srcRect/>
                     <a:stretch>
                       <a:fillRect/>
                     </a:stretch>
                   </pic:blipFill>
-                  <pic:spPr>
+                  <pic:spPr bwMode="auto">
                     <a:xfrm>
                       <a:off x="0" y="0"/>
-                      <a:ext cx="5577840" cy="6304518"/>
+                      <a:ext cx="5577840" cy="6304517"/>
                     </a:xfrm>
-                    <a:prstGeom prst="rect"/>
+                    <a:prstGeom prst="rect">
+                      <a:avLst/>
+                    </a:prstGeom>
+                    <a:noFill/>
+                    <a:ln w="9525">
+                      <a:noFill/>
+                      <a:miter lim="800000"/>
+                      <a:headEnd/>
+                      <a:tailEnd/>
+                    </a:ln>
                   </pic:spPr>
                 </pic:pic>
               </a:graphicData>
@@ -40686,7 +40743,7 @@
           <w:color w:val="FF0000"/>
           <w:u w:val="single"/>
         </w:rPr>
-        <w:t>Figure 5.3: PoCol reward distribution and verification in round r, from detection of the winning nonce by the winner miner to balance updates at all registered miners.</w:t>
+        <w:t xml:space="preserve">Figure 5.3: PoCol reward distribution and verification in round r, from detection of the winning nonce by the winner miner to balance updates at all registered miners.</w:t>
       </w:r>
     </w:p>
     <w:p>
@@ -41682,7 +41739,7 @@
           <w:color w:val="FF0000"/>
           <w:u w:val="single"/>
         </w:rPr>
-        <w:t>Figure 5.4 shows the explicit leaving procedure of Sections 5.4.2 and 5.10.2. The leaving miner (Miner C) creates a signed deregistration transaction carrying its identifier, network address, and a timestamp, and sends it to the network. Each receiving miner validates the signature and the current membership of Miner C before admitting the transaction to its mempool. The deregistration transaction is then included in the next collaboratively mined block; once the block is verified and appended to the ledger, every node derives the updated registered miner set containing only Miner A and Miner B, and Miner C stops participating in subsequent rounds. The next invocation of the nonce distribution function therefore partitions the nonce space over the reduced miner set, so no nonce range is wasted on the departed miner.</w:t>
+        <w:t xml:space="preserve">Figure 5.4 shows the explicit leaving procedure of Sections 5.4.2 and 5.10.2. The leaving miner (Miner C) creates a signed deregistration transaction carrying its identifier, network address, and a timestamp, and sends it to the network. Each receiving miner validates the signature and the current membership of Miner C before admitting the transaction to its mempool. The deregistration transaction is then included in the next collaboratively mined block; once the block is verified and appended to the ledger, every node derives the updated registered miner set containing only Miner A and Miner B, and Miner C stops participating in subsequent rounds. The next invocation of the nonce distribution function therefore partitions the nonce space over the reduced miner set, so no nonce range is wasted on the departed miner.</w:t>
       </w:r>
     </w:p>
     <w:p>
@@ -41691,31 +41748,50 @@
       </w:pPr>
       <w:r>
         <w:drawing>
-          <wp:inline xmlns:a="http://schemas.openxmlformats.org/drawingml/2006/main" xmlns:pic="http://schemas.openxmlformats.org/drawingml/2006/picture">
+          <wp:inline distT="0" distB="0" distL="0" distR="0" wp14:anchorId="29C7B066" wp14:editId="075D8F13">
             <wp:extent cx="5577840" cy="5516958"/>
-            <wp:docPr id="1073708024" name="Picture 1073708024"/>
+            <wp:effectExtent l="0" t="0" r="0" b="0"/>
+            <wp:docPr id="910003" name="PoCol Figure 5.4" descr="PoCol Figure 5.4"/>
             <wp:cNvGraphicFramePr>
-              <a:graphicFrameLocks noChangeAspect="1"/>
+              <a:graphicFrameLocks xmlns:a="http://schemas.openxmlformats.org/drawingml/2006/main" noChangeAspect="1"/>
             </wp:cNvGraphicFramePr>
-            <a:graphic>
+            <a:graphic xmlns:a="http://schemas.openxmlformats.org/drawingml/2006/main">
               <a:graphicData uri="http://schemas.openxmlformats.org/drawingml/2006/picture">
-                <pic:pic>
+                <pic:pic xmlns:pic="http://schemas.openxmlformats.org/drawingml/2006/picture">
                   <pic:nvPicPr>
-                    <pic:cNvPr id="0" name="fig_leaving.png"/>
-                    <pic:cNvPicPr/>
+                    <pic:cNvPr id="910003" name="PoCol Figure 5.4" descr="C:\Users\hp\Desktop\iug640x480.jpg"/>
+                    <pic:cNvPicPr>
+                      <a:picLocks noChangeAspect="1" noChangeArrowheads="1"/>
+                    </pic:cNvPicPr>
                   </pic:nvPicPr>
                   <pic:blipFill>
-                    <a:blip r:embed="rId26"/>
+                    <a:blip r:embed="rId9031" cstate="print">
+                      <a:extLst>
+                        <a:ext uri="{28A0092B-C50C-407E-A947-70E740481C1C}">
+                          <a14:useLocalDpi xmlns:a14="http://schemas.microsoft.com/office/drawing/2010/main" val="0"/>
+                        </a:ext>
+                      </a:extLst>
+                    </a:blip>
+                    <a:srcRect/>
                     <a:stretch>
                       <a:fillRect/>
                     </a:stretch>
                   </pic:blipFill>
-                  <pic:spPr>
+                  <pic:spPr bwMode="auto">
                     <a:xfrm>
                       <a:off x="0" y="0"/>
                       <a:ext cx="5577840" cy="5516958"/>
                     </a:xfrm>
-                    <a:prstGeom prst="rect"/>
+                    <a:prstGeom prst="rect">
+                      <a:avLst/>
+                    </a:prstGeom>
+                    <a:noFill/>
+                    <a:ln w="9525">
+                      <a:noFill/>
+                      <a:miter lim="800000"/>
+                      <a:headEnd/>
+                      <a:tailEnd/>
+                    </a:ln>
                   </pic:spPr>
                 </pic:pic>
               </a:graphicData>
@@ -41733,7 +41809,7 @@
           <w:color w:val="FF0000"/>
           <w:u w:val="single"/>
         </w:rPr>
-        <w:t>Figure 5.4: PoCol miner leaving sequence, showing explicit deregistration of Miner C and the resulting update of the registered miner set.</w:t>
+        <w:t xml:space="preserve">Figure 5.4: PoCol miner leaving sequence, showing explicit deregistration of Miner C and the resulting update of the registered miner set.</w:t>
       </w:r>
     </w:p>
     <w:p>

</xml_diff>